<commit_message>
Branch: main; Updated canonical search string and added strings with syntax specific to each search base.
</commit_message>
<xml_diff>
--- a/research_protocol/protocol.docx
+++ b/research_protocol/protocol.docx
@@ -1453,7 +1453,14 @@
           </w:tcPr>
           <w:p>
             <w:r>
-              <w:t>P - População</w:t>
+              <w:rPr>
+                <w:b/>
+                <w:bCs/>
+              </w:rPr>
+              <w:t>P</w:t>
+            </w:r>
+            <w:r>
+              <w:t xml:space="preserve"> - População</w:t>
             </w:r>
           </w:p>
         </w:tc>
@@ -1493,7 +1500,14 @@
           </w:tcPr>
           <w:p>
             <w:r>
-              <w:t>I - Intervenção</w:t>
+              <w:rPr>
+                <w:b/>
+                <w:bCs/>
+              </w:rPr>
+              <w:t>I</w:t>
+            </w:r>
+            <w:r>
+              <w:t xml:space="preserve"> - Intervenção</w:t>
             </w:r>
           </w:p>
         </w:tc>
@@ -1518,7 +1532,14 @@
           </w:tcPr>
           <w:p>
             <w:r>
-              <w:t>C - Comparação</w:t>
+              <w:rPr>
+                <w:b/>
+                <w:bCs/>
+              </w:rPr>
+              <w:t>C</w:t>
+            </w:r>
+            <w:r>
+              <w:t xml:space="preserve"> - Comparação</w:t>
             </w:r>
           </w:p>
         </w:tc>
@@ -1567,7 +1588,14 @@
           </w:tcPr>
           <w:p>
             <w:r>
-              <w:t>O - Outcome (Resultado)</w:t>
+              <w:rPr>
+                <w:b/>
+                <w:bCs/>
+              </w:rPr>
+              <w:t>O</w:t>
+            </w:r>
+            <w:r>
+              <w:t xml:space="preserve"> - Outcome (Resultado)</w:t>
             </w:r>
           </w:p>
         </w:tc>
@@ -1630,7 +1658,14 @@
           </w:tcPr>
           <w:p>
             <w:r>
-              <w:t>C - Contexto</w:t>
+              <w:rPr>
+                <w:b/>
+                <w:bCs/>
+              </w:rPr>
+              <w:t>C</w:t>
+            </w:r>
+            <w:r>
+              <w:t xml:space="preserve"> - Contexto</w:t>
             </w:r>
           </w:p>
         </w:tc>
@@ -1672,32 +1707,88 @@
           <w:b/>
           <w:bCs/>
         </w:rPr>
-        <w:t>4. STRINGS DE BUSCA</w:t>
-      </w:r>
-    </w:p>
-    <w:p>
-      <w:pPr>
-        <w:rPr>
-          <w:b/>
-          <w:bCs/>
-        </w:rPr>
-      </w:pPr>
-    </w:p>
-    <w:p>
-      <w:r>
-        <w:t>("source code" OR "codebase" OR "code repository") AND</w:t>
-      </w:r>
-    </w:p>
-    <w:p>
-      <w:r>
-        <w:t>("Retrieval-Augmented Generation" OR "RAG") AND</w:t>
-      </w:r>
-    </w:p>
-    <w:p>
-      <w:r>
-        <w:t>("LLM" OR "Large Language Model" OR "GenAI" OR "Generative AI")</w:t>
-      </w:r>
-    </w:p>
+        <w:t>4. STRING DE BUSCA</w:t>
+      </w:r>
+      <w:r>
+        <w:rPr>
+          <w:b/>
+          <w:bCs/>
+        </w:rPr>
+        <w:t xml:space="preserve"> (CANÔNICA)</w:t>
+      </w:r>
+    </w:p>
+    <w:p>
+      <w:pPr>
+        <w:rPr>
+          <w:b/>
+          <w:bCs/>
+        </w:rPr>
+      </w:pPr>
+    </w:p>
+    <w:tbl>
+      <w:tblPr>
+        <w:tblStyle w:val="Tabelacomgrade"/>
+        <w:tblW w:w="0" w:type="auto"/>
+        <w:shd w:val="clear" w:color="auto" w:fill="F2F2F2" w:themeFill="background1" w:themeFillShade="F2"/>
+        <w:tblLook w:val="04A0" w:firstRow="1" w:lastRow="0" w:firstColumn="1" w:lastColumn="0" w:noHBand="0" w:noVBand="1"/>
+      </w:tblPr>
+      <w:tblGrid>
+        <w:gridCol w:w="9019"/>
+      </w:tblGrid>
+      <w:tr>
+        <w:tc>
+          <w:tcPr>
+            <w:tcW w:w="9019" w:type="dxa"/>
+            <w:shd w:val="clear" w:color="auto" w:fill="F2F2F2" w:themeFill="background1" w:themeFillShade="F2"/>
+          </w:tcPr>
+          <w:p>
+            <w:pPr>
+              <w:rPr>
+                <w:sz w:val="20"/>
+                <w:szCs w:val="20"/>
+              </w:rPr>
+            </w:pPr>
+            <w:r>
+              <w:rPr>
+                <w:sz w:val="20"/>
+                <w:szCs w:val="20"/>
+              </w:rPr>
+              <w:t>("source code" OR "source codes" OR "codebase" OR "code repository" OR "code search") AND</w:t>
+            </w:r>
+          </w:p>
+          <w:p>
+            <w:pPr>
+              <w:rPr>
+                <w:sz w:val="20"/>
+                <w:szCs w:val="20"/>
+              </w:rPr>
+            </w:pPr>
+            <w:r>
+              <w:rPr>
+                <w:sz w:val="20"/>
+                <w:szCs w:val="20"/>
+              </w:rPr>
+              <w:t>("Retrieval-Augmented Generation" OR "Retrieval Augmented Generation" OR "RAG") AND</w:t>
+            </w:r>
+          </w:p>
+          <w:p>
+            <w:pPr>
+              <w:rPr>
+                <w:b/>
+                <w:bCs/>
+              </w:rPr>
+            </w:pPr>
+            <w:r>
+              <w:rPr>
+                <w:sz w:val="20"/>
+                <w:szCs w:val="20"/>
+              </w:rPr>
+              <w:t>("LLM" OR "Large Language Model" OR "GenAI" OR "Generative AI")</w:t>
+            </w:r>
+          </w:p>
+        </w:tc>
+      </w:tr>
+    </w:tbl>
     <w:p/>
     <w:p>
       <w:pPr>
@@ -1865,13 +1956,524 @@
         </w:rPr>
         <w:t>ASES</w:t>
       </w:r>
-    </w:p>
-    <w:p>
-      <w:pPr>
-        <w:rPr>
-          <w:b/>
-          <w:bCs/>
-        </w:rPr>
+      <w:r>
+        <w:rPr>
+          <w:b/>
+          <w:bCs/>
+        </w:rPr>
+        <w:t xml:space="preserve"> DE BUSCA</w:t>
+      </w:r>
+    </w:p>
+    <w:p>
+      <w:pPr>
+        <w:rPr>
+          <w:b/>
+          <w:bCs/>
+        </w:rPr>
+      </w:pPr>
+    </w:p>
+    <w:p>
+      <w:pPr>
+        <w:rPr>
+          <w:b/>
+          <w:bCs/>
+        </w:rPr>
+      </w:pPr>
+      <w:r>
+        <w:rPr>
+          <w:b/>
+          <w:bCs/>
+        </w:rPr>
+        <w:t>5</w:t>
+      </w:r>
+      <w:r>
+        <w:rPr>
+          <w:b/>
+          <w:bCs/>
+        </w:rPr>
+        <w:t xml:space="preserve">.1. </w:t>
+      </w:r>
+      <w:r>
+        <w:rPr>
+          <w:b/>
+          <w:bCs/>
+        </w:rPr>
+        <w:t>ACM Digital Library</w:t>
+      </w:r>
+    </w:p>
+    <w:p>
+      <w:pPr>
+        <w:jc w:val="both"/>
+      </w:pPr>
+      <w:r>
+        <w:br/>
+      </w:r>
+      <w:r>
+        <w:t xml:space="preserve">Disponível em </w:t>
+      </w:r>
+      <w:hyperlink r:id="rId6" w:history="1">
+        <w:r>
+          <w:rPr>
+            <w:rStyle w:val="Hyperlink"/>
+          </w:rPr>
+          <w:t>https://dl.acm.org/</w:t>
+        </w:r>
+      </w:hyperlink>
+      <w:r>
+        <w:t>, é o p</w:t>
+      </w:r>
+      <w:r>
+        <w:t xml:space="preserve">rincipal repositório de publicações da Association for Computing Machinery (ACM), com cobertura abrangente de Engenharia de Software e áreas correlatas. Indexa venues de alto impacto como ESEC/FSE, ISSTA, ICSE (co-publicada com IEEE) e periódicos como TOSEM e CACM. Oferece busca avançada com operadores booleanos e exportação estruturada em BibTeX </w:t>
+      </w:r>
+      <w:r>
+        <w:t>-</w:t>
+      </w:r>
+      <w:r>
+        <w:t xml:space="preserve"> fundamentais para a condução sistemática e reproduzível da busca.</w:t>
+      </w:r>
+      <w:r>
+        <w:br/>
+      </w:r>
+    </w:p>
+    <w:p>
+      <w:pPr>
+        <w:jc w:val="both"/>
+        <w:rPr>
+          <w:b/>
+          <w:bCs/>
+        </w:rPr>
+      </w:pPr>
+      <w:r>
+        <w:rPr>
+          <w:b/>
+          <w:bCs/>
+        </w:rPr>
+        <w:t>5.1.1. String adaptada para sintaxe</w:t>
+      </w:r>
+      <w:r>
+        <w:rPr>
+          <w:b/>
+          <w:bCs/>
+        </w:rPr>
+        <w:t xml:space="preserve"> de busca</w:t>
+      </w:r>
+      <w:r>
+        <w:rPr>
+          <w:b/>
+          <w:bCs/>
+        </w:rPr>
+        <w:t xml:space="preserve"> específica </w:t>
+      </w:r>
+      <w:r>
+        <w:rPr>
+          <w:b/>
+          <w:bCs/>
+        </w:rPr>
+        <w:t>n</w:t>
+      </w:r>
+      <w:r>
+        <w:rPr>
+          <w:b/>
+          <w:bCs/>
+        </w:rPr>
+        <w:t>o ACM</w:t>
+      </w:r>
+    </w:p>
+    <w:p>
+      <w:pPr>
+        <w:jc w:val="both"/>
+      </w:pPr>
+    </w:p>
+    <w:tbl>
+      <w:tblPr>
+        <w:tblStyle w:val="Tabelacomgrade"/>
+        <w:tblW w:w="0" w:type="auto"/>
+        <w:shd w:val="clear" w:color="auto" w:fill="F2F2F2" w:themeFill="background1" w:themeFillShade="F2"/>
+        <w:tblLook w:val="04A0" w:firstRow="1" w:lastRow="0" w:firstColumn="1" w:lastColumn="0" w:noHBand="0" w:noVBand="1"/>
+      </w:tblPr>
+      <w:tblGrid>
+        <w:gridCol w:w="9019"/>
+      </w:tblGrid>
+      <w:tr>
+        <w:tc>
+          <w:tcPr>
+            <w:tcW w:w="9019" w:type="dxa"/>
+            <w:shd w:val="clear" w:color="auto" w:fill="F2F2F2" w:themeFill="background1" w:themeFillShade="F2"/>
+          </w:tcPr>
+          <w:p>
+            <w:pPr>
+              <w:rPr>
+                <w:rFonts w:ascii="Consolas" w:hAnsi="Consolas"/>
+                <w:sz w:val="20"/>
+                <w:szCs w:val="20"/>
+              </w:rPr>
+            </w:pPr>
+            <w:r>
+              <w:rPr>
+                <w:rFonts w:ascii="Consolas" w:hAnsi="Consolas"/>
+                <w:sz w:val="20"/>
+                <w:szCs w:val="20"/>
+              </w:rPr>
+              <w:t>(Title:"source code" OR Title:"source codes" OR Title:"codebase" OR Title:"code repository" OR Title:"code search" OR</w:t>
+            </w:r>
+          </w:p>
+          <w:p>
+            <w:pPr>
+              <w:rPr>
+                <w:rFonts w:ascii="Consolas" w:hAnsi="Consolas"/>
+                <w:sz w:val="20"/>
+                <w:szCs w:val="20"/>
+              </w:rPr>
+            </w:pPr>
+            <w:r>
+              <w:rPr>
+                <w:rFonts w:ascii="Consolas" w:hAnsi="Consolas"/>
+                <w:sz w:val="20"/>
+                <w:szCs w:val="20"/>
+              </w:rPr>
+              <w:t xml:space="preserve"> Abstract:"source code" OR Abstract:"source codes" OR Abstract:"codebase" OR Abstract:"code repository" OR Abstract:"code search" OR</w:t>
+            </w:r>
+          </w:p>
+          <w:p>
+            <w:pPr>
+              <w:rPr>
+                <w:rFonts w:ascii="Consolas" w:hAnsi="Consolas"/>
+                <w:sz w:val="20"/>
+                <w:szCs w:val="20"/>
+              </w:rPr>
+            </w:pPr>
+            <w:r>
+              <w:rPr>
+                <w:rFonts w:ascii="Consolas" w:hAnsi="Consolas"/>
+                <w:sz w:val="20"/>
+                <w:szCs w:val="20"/>
+              </w:rPr>
+              <w:t xml:space="preserve"> Keyword:"source code" OR Keyword:"source codes" OR Keyword:"codebase" OR Keyword:"code repository" OR Keyword:"code search")</w:t>
+            </w:r>
+          </w:p>
+          <w:p>
+            <w:pPr>
+              <w:rPr>
+                <w:rFonts w:ascii="Consolas" w:hAnsi="Consolas"/>
+                <w:sz w:val="20"/>
+                <w:szCs w:val="20"/>
+              </w:rPr>
+            </w:pPr>
+            <w:r>
+              <w:rPr>
+                <w:rFonts w:ascii="Consolas" w:hAnsi="Consolas"/>
+                <w:sz w:val="20"/>
+                <w:szCs w:val="20"/>
+              </w:rPr>
+              <w:t>AND</w:t>
+            </w:r>
+          </w:p>
+          <w:p>
+            <w:pPr>
+              <w:rPr>
+                <w:rFonts w:ascii="Consolas" w:hAnsi="Consolas"/>
+                <w:sz w:val="20"/>
+                <w:szCs w:val="20"/>
+              </w:rPr>
+            </w:pPr>
+            <w:r>
+              <w:rPr>
+                <w:rFonts w:ascii="Consolas" w:hAnsi="Consolas"/>
+                <w:sz w:val="20"/>
+                <w:szCs w:val="20"/>
+              </w:rPr>
+              <w:t>(Title:"Retrieval-Augmented Generation" OR Title:"Retrieval Augmented Generation" OR Title:"RAG" OR</w:t>
+            </w:r>
+          </w:p>
+          <w:p>
+            <w:pPr>
+              <w:rPr>
+                <w:rFonts w:ascii="Consolas" w:hAnsi="Consolas"/>
+                <w:sz w:val="20"/>
+                <w:szCs w:val="20"/>
+              </w:rPr>
+            </w:pPr>
+            <w:r>
+              <w:rPr>
+                <w:rFonts w:ascii="Consolas" w:hAnsi="Consolas"/>
+                <w:sz w:val="20"/>
+                <w:szCs w:val="20"/>
+              </w:rPr>
+              <w:t xml:space="preserve"> Abstract:"Retrieval-Augmented Generation" OR Abstract:"Retrieval Augmented Generation" OR Abstract:"RAG" OR</w:t>
+            </w:r>
+          </w:p>
+          <w:p>
+            <w:pPr>
+              <w:rPr>
+                <w:rFonts w:ascii="Consolas" w:hAnsi="Consolas"/>
+                <w:sz w:val="20"/>
+                <w:szCs w:val="20"/>
+              </w:rPr>
+            </w:pPr>
+            <w:r>
+              <w:rPr>
+                <w:rFonts w:ascii="Consolas" w:hAnsi="Consolas"/>
+                <w:sz w:val="20"/>
+                <w:szCs w:val="20"/>
+              </w:rPr>
+              <w:t xml:space="preserve"> Keyword:"Retrieval-Augmented Generation" OR Keyword:"Retrieval Augmented Generation" OR Keyword:"RAG")</w:t>
+            </w:r>
+          </w:p>
+          <w:p>
+            <w:pPr>
+              <w:rPr>
+                <w:rFonts w:ascii="Consolas" w:hAnsi="Consolas"/>
+                <w:sz w:val="20"/>
+                <w:szCs w:val="20"/>
+              </w:rPr>
+            </w:pPr>
+            <w:r>
+              <w:rPr>
+                <w:rFonts w:ascii="Consolas" w:hAnsi="Consolas"/>
+                <w:sz w:val="20"/>
+                <w:szCs w:val="20"/>
+              </w:rPr>
+              <w:t>AND</w:t>
+            </w:r>
+          </w:p>
+          <w:p>
+            <w:pPr>
+              <w:rPr>
+                <w:rFonts w:ascii="Consolas" w:hAnsi="Consolas"/>
+                <w:sz w:val="20"/>
+                <w:szCs w:val="20"/>
+              </w:rPr>
+            </w:pPr>
+            <w:r>
+              <w:rPr>
+                <w:rFonts w:ascii="Consolas" w:hAnsi="Consolas"/>
+                <w:sz w:val="20"/>
+                <w:szCs w:val="20"/>
+              </w:rPr>
+              <w:t>(Title:"LLM" OR Title:"Large Language Model" OR Title:"GenAI" OR Title:"Generative AI" OR</w:t>
+            </w:r>
+          </w:p>
+          <w:p>
+            <w:pPr>
+              <w:rPr>
+                <w:rFonts w:ascii="Consolas" w:hAnsi="Consolas"/>
+                <w:sz w:val="20"/>
+                <w:szCs w:val="20"/>
+              </w:rPr>
+            </w:pPr>
+            <w:r>
+              <w:rPr>
+                <w:rFonts w:ascii="Consolas" w:hAnsi="Consolas"/>
+                <w:sz w:val="20"/>
+                <w:szCs w:val="20"/>
+              </w:rPr>
+              <w:t xml:space="preserve"> Abstract:"LLM" OR Abstract:"Large Language Model" OR Abstract:"GenAI" OR Abstract:"Generative AI" OR</w:t>
+            </w:r>
+          </w:p>
+          <w:p>
+            <w:pPr>
+              <w:rPr>
+                <w:rFonts w:ascii="Consolas" w:hAnsi="Consolas"/>
+                <w:sz w:val="20"/>
+                <w:szCs w:val="20"/>
+              </w:rPr>
+            </w:pPr>
+            <w:r>
+              <w:rPr>
+                <w:rFonts w:ascii="Consolas" w:hAnsi="Consolas"/>
+                <w:sz w:val="20"/>
+                <w:szCs w:val="20"/>
+              </w:rPr>
+              <w:t xml:space="preserve"> Keyword:"LLM" OR Keyword:"Large Language Model" OR Keyword:"GenAI" OR Keyword:"Generative AI")</w:t>
+            </w:r>
+          </w:p>
+        </w:tc>
+      </w:tr>
+    </w:tbl>
+    <w:p/>
+    <w:p>
+      <w:pPr>
+        <w:jc w:val="both"/>
+      </w:pPr>
+    </w:p>
+    <w:p>
+      <w:pPr>
+        <w:rPr>
+          <w:b/>
+          <w:bCs/>
+        </w:rPr>
+      </w:pPr>
+      <w:r>
+        <w:rPr>
+          <w:b/>
+          <w:bCs/>
+        </w:rPr>
+        <w:t>5.</w:t>
+      </w:r>
+      <w:r>
+        <w:rPr>
+          <w:b/>
+          <w:bCs/>
+        </w:rPr>
+        <w:t>2</w:t>
+      </w:r>
+      <w:r>
+        <w:rPr>
+          <w:b/>
+          <w:bCs/>
+        </w:rPr>
+        <w:t xml:space="preserve">. </w:t>
+      </w:r>
+      <w:r>
+        <w:rPr>
+          <w:b/>
+          <w:bCs/>
+        </w:rPr>
+        <w:t>IEEE Explore</w:t>
+      </w:r>
+    </w:p>
+    <w:p/>
+    <w:p>
+      <w:pPr>
+        <w:jc w:val="both"/>
+      </w:pPr>
+      <w:r>
+        <w:t xml:space="preserve">Disponível em </w:t>
+      </w:r>
+      <w:hyperlink r:id="rId7" w:history="1">
+        <w:r>
+          <w:rPr>
+            <w:rStyle w:val="Hyperlink"/>
+          </w:rPr>
+          <w:t>https://ieeexplore.ieee.org/</w:t>
+        </w:r>
+      </w:hyperlink>
+      <w:r>
+        <w:t>, é o p</w:t>
+      </w:r>
+      <w:r>
+        <w:t>rincipal repositório de publicações IEEE e IET em Engenharia de Software, Computação e áreas afins. Indexa conferências de alto impacto como ICSE, ASE, SANER e MSR, além dos principais periódicos da área (e.g., IEEE TSE, IEEE Software). Oferece busca avançada com exportação em CSV/BibTeX.</w:t>
+      </w:r>
+    </w:p>
+    <w:p>
+      <w:pPr>
+        <w:jc w:val="both"/>
+      </w:pPr>
+    </w:p>
+    <w:p>
+      <w:pPr>
+        <w:jc w:val="both"/>
+      </w:pPr>
+    </w:p>
+    <w:p>
+      <w:pPr>
+        <w:jc w:val="both"/>
+      </w:pPr>
+    </w:p>
+    <w:p>
+      <w:pPr>
+        <w:jc w:val="both"/>
+      </w:pPr>
+    </w:p>
+    <w:p>
+      <w:pPr>
+        <w:jc w:val="both"/>
+      </w:pPr>
+    </w:p>
+    <w:p>
+      <w:pPr>
+        <w:jc w:val="both"/>
+      </w:pPr>
+    </w:p>
+    <w:p>
+      <w:pPr>
+        <w:jc w:val="both"/>
+      </w:pPr>
+    </w:p>
+    <w:p>
+      <w:pPr>
+        <w:jc w:val="both"/>
+      </w:pPr>
+    </w:p>
+    <w:p>
+      <w:pPr>
+        <w:jc w:val="both"/>
+      </w:pPr>
+    </w:p>
+    <w:p>
+      <w:pPr>
+        <w:jc w:val="both"/>
+      </w:pPr>
+    </w:p>
+    <w:p>
+      <w:pPr>
+        <w:jc w:val="both"/>
+        <w:rPr>
+          <w:b/>
+          <w:bCs/>
+        </w:rPr>
+      </w:pPr>
+      <w:r>
+        <w:rPr>
+          <w:b/>
+          <w:bCs/>
+        </w:rPr>
+        <w:lastRenderedPageBreak/>
+        <w:t>5.</w:t>
+      </w:r>
+      <w:r>
+        <w:rPr>
+          <w:b/>
+          <w:bCs/>
+        </w:rPr>
+        <w:t>2</w:t>
+      </w:r>
+      <w:r>
+        <w:rPr>
+          <w:b/>
+          <w:bCs/>
+        </w:rPr>
+        <w:t>.1. String adaptada para sintaxe</w:t>
+      </w:r>
+      <w:r>
+        <w:rPr>
+          <w:b/>
+          <w:bCs/>
+        </w:rPr>
+        <w:t xml:space="preserve"> de busca</w:t>
+      </w:r>
+      <w:r>
+        <w:rPr>
+          <w:b/>
+          <w:bCs/>
+        </w:rPr>
+        <w:t xml:space="preserve"> específica </w:t>
+      </w:r>
+      <w:r>
+        <w:rPr>
+          <w:b/>
+          <w:bCs/>
+        </w:rPr>
+        <w:t>n</w:t>
+      </w:r>
+      <w:r>
+        <w:rPr>
+          <w:b/>
+          <w:bCs/>
+        </w:rPr>
+        <w:t xml:space="preserve">o </w:t>
+      </w:r>
+      <w:r>
+        <w:rPr>
+          <w:b/>
+          <w:bCs/>
+        </w:rPr>
+        <w:t>IEEE</w:t>
+      </w:r>
+    </w:p>
+    <w:p>
+      <w:pPr>
+        <w:jc w:val="both"/>
       </w:pPr>
     </w:p>
     <w:tbl>
@@ -1881,179 +2483,437 @@
         <w:tblLook w:val="04A0" w:firstRow="1" w:lastRow="0" w:firstColumn="1" w:lastColumn="0" w:noHBand="0" w:noVBand="1"/>
       </w:tblPr>
       <w:tblGrid>
-        <w:gridCol w:w="3006"/>
-        <w:gridCol w:w="3006"/>
-        <w:gridCol w:w="3007"/>
+        <w:gridCol w:w="9019"/>
       </w:tblGrid>
       <w:tr>
         <w:tc>
           <w:tcPr>
-            <w:tcW w:w="3006" w:type="dxa"/>
+            <w:tcW w:w="9019" w:type="dxa"/>
+            <w:shd w:val="clear" w:color="auto" w:fill="F2F2F2" w:themeFill="background1" w:themeFillShade="F2"/>
           </w:tcPr>
           <w:p>
             <w:pPr>
-              <w:rPr>
-                <w:b/>
-                <w:bCs/>
+              <w:jc w:val="both"/>
+              <w:rPr>
+                <w:rFonts w:ascii="Consolas" w:hAnsi="Consolas"/>
+                <w:sz w:val="20"/>
+                <w:szCs w:val="20"/>
               </w:rPr>
             </w:pPr>
             <w:r>
               <w:rPr>
-                <w:b/>
-                <w:bCs/>
-              </w:rPr>
-              <w:t>Base</w:t>
-            </w:r>
-          </w:p>
-        </w:tc>
-        <w:tc>
-          <w:tcPr>
-            <w:tcW w:w="3006" w:type="dxa"/>
-          </w:tcPr>
+                <w:rFonts w:ascii="Consolas" w:hAnsi="Consolas"/>
+                <w:sz w:val="20"/>
+                <w:szCs w:val="20"/>
+              </w:rPr>
+              <w:t>("Document Title":"source code" OR "Document Title":"source codes" OR "Document Title":"codebase" OR "Document Title":"code repository" OR "Document Title":"code search" OR</w:t>
+            </w:r>
+          </w:p>
           <w:p>
             <w:pPr>
-              <w:rPr>
-                <w:b/>
-                <w:bCs/>
+              <w:jc w:val="both"/>
+              <w:rPr>
+                <w:rFonts w:ascii="Consolas" w:hAnsi="Consolas"/>
+                <w:sz w:val="20"/>
+                <w:szCs w:val="20"/>
               </w:rPr>
             </w:pPr>
             <w:r>
               <w:rPr>
-                <w:b/>
-                <w:bCs/>
-              </w:rPr>
-              <w:t>URL</w:t>
-            </w:r>
-          </w:p>
-        </w:tc>
-        <w:tc>
-          <w:tcPr>
-            <w:tcW w:w="3007" w:type="dxa"/>
-          </w:tcPr>
+                <w:rFonts w:ascii="Consolas" w:hAnsi="Consolas"/>
+                <w:sz w:val="20"/>
+                <w:szCs w:val="20"/>
+              </w:rPr>
+              <w:t xml:space="preserve"> "Abstract":"source code" OR "Abstract":"source codes" OR "Abstract":"codebase" OR "Abstract":"code repository" OR "Abstract":"code search" OR</w:t>
+            </w:r>
+          </w:p>
           <w:p>
             <w:pPr>
-              <w:rPr>
-                <w:b/>
-                <w:bCs/>
+              <w:jc w:val="both"/>
+              <w:rPr>
+                <w:rFonts w:ascii="Consolas" w:hAnsi="Consolas"/>
+                <w:sz w:val="20"/>
+                <w:szCs w:val="20"/>
               </w:rPr>
             </w:pPr>
             <w:r>
               <w:rPr>
-                <w:b/>
-                <w:bCs/>
-              </w:rPr>
-              <w:t>Justificativa</w:t>
+                <w:rFonts w:ascii="Consolas" w:hAnsi="Consolas"/>
+                <w:sz w:val="20"/>
+                <w:szCs w:val="20"/>
+              </w:rPr>
+              <w:t xml:space="preserve"> "Author Keywords":"source code" OR "Author Keywords":"source codes" OR "Author Keywords":"codebase" OR "Author Keywords":"code repository" OR "Author Keywords":"code search")</w:t>
+            </w:r>
+          </w:p>
+          <w:p>
+            <w:pPr>
+              <w:jc w:val="both"/>
+              <w:rPr>
+                <w:rFonts w:ascii="Consolas" w:hAnsi="Consolas"/>
+                <w:sz w:val="20"/>
+                <w:szCs w:val="20"/>
+              </w:rPr>
+            </w:pPr>
+            <w:r>
+              <w:rPr>
+                <w:rFonts w:ascii="Consolas" w:hAnsi="Consolas"/>
+                <w:sz w:val="20"/>
+                <w:szCs w:val="20"/>
+              </w:rPr>
+              <w:t>AND</w:t>
+            </w:r>
+          </w:p>
+          <w:p>
+            <w:pPr>
+              <w:jc w:val="both"/>
+              <w:rPr>
+                <w:rFonts w:ascii="Consolas" w:hAnsi="Consolas"/>
+                <w:sz w:val="20"/>
+                <w:szCs w:val="20"/>
+              </w:rPr>
+            </w:pPr>
+            <w:r>
+              <w:rPr>
+                <w:rFonts w:ascii="Consolas" w:hAnsi="Consolas"/>
+                <w:sz w:val="20"/>
+                <w:szCs w:val="20"/>
+              </w:rPr>
+              <w:t>("Document Title":"Retrieval-Augmented Generation" OR "Document Title":"Retrieval Augmented Generation" OR "Document Title":"RAG" OR</w:t>
+            </w:r>
+          </w:p>
+          <w:p>
+            <w:pPr>
+              <w:jc w:val="both"/>
+              <w:rPr>
+                <w:rFonts w:ascii="Consolas" w:hAnsi="Consolas"/>
+                <w:sz w:val="20"/>
+                <w:szCs w:val="20"/>
+              </w:rPr>
+            </w:pPr>
+            <w:r>
+              <w:rPr>
+                <w:rFonts w:ascii="Consolas" w:hAnsi="Consolas"/>
+                <w:sz w:val="20"/>
+                <w:szCs w:val="20"/>
+              </w:rPr>
+              <w:t xml:space="preserve"> "Abstract":"Retrieval-Augmented Generation" OR "Abstract":"Retrieval Augmented Generation" OR "Abstract":"RAG" OR</w:t>
+            </w:r>
+          </w:p>
+          <w:p>
+            <w:pPr>
+              <w:jc w:val="both"/>
+              <w:rPr>
+                <w:rFonts w:ascii="Consolas" w:hAnsi="Consolas"/>
+                <w:sz w:val="20"/>
+                <w:szCs w:val="20"/>
+              </w:rPr>
+            </w:pPr>
+            <w:r>
+              <w:rPr>
+                <w:rFonts w:ascii="Consolas" w:hAnsi="Consolas"/>
+                <w:sz w:val="20"/>
+                <w:szCs w:val="20"/>
+              </w:rPr>
+              <w:t xml:space="preserve"> "Author Keywords":"Retrieval-Augmented Generation" OR "Author Keywords":"Retrieval Augmented Generation" OR "Author Keywords":"RAG")</w:t>
+            </w:r>
+          </w:p>
+          <w:p>
+            <w:pPr>
+              <w:jc w:val="both"/>
+              <w:rPr>
+                <w:rFonts w:ascii="Consolas" w:hAnsi="Consolas"/>
+                <w:sz w:val="20"/>
+                <w:szCs w:val="20"/>
+              </w:rPr>
+            </w:pPr>
+            <w:r>
+              <w:rPr>
+                <w:rFonts w:ascii="Consolas" w:hAnsi="Consolas"/>
+                <w:sz w:val="20"/>
+                <w:szCs w:val="20"/>
+              </w:rPr>
+              <w:t>AND</w:t>
+            </w:r>
+          </w:p>
+          <w:p>
+            <w:pPr>
+              <w:jc w:val="both"/>
+              <w:rPr>
+                <w:rFonts w:ascii="Consolas" w:hAnsi="Consolas"/>
+                <w:sz w:val="20"/>
+                <w:szCs w:val="20"/>
+              </w:rPr>
+            </w:pPr>
+            <w:r>
+              <w:rPr>
+                <w:rFonts w:ascii="Consolas" w:hAnsi="Consolas"/>
+                <w:sz w:val="20"/>
+                <w:szCs w:val="20"/>
+              </w:rPr>
+              <w:t>("Document Title":"LLM" OR "Document Title":"Large Language Model" OR "Document Title":"GenAI" OR "Document Title":"Generative AI" OR</w:t>
+            </w:r>
+          </w:p>
+          <w:p>
+            <w:pPr>
+              <w:jc w:val="both"/>
+              <w:rPr>
+                <w:rFonts w:ascii="Consolas" w:hAnsi="Consolas"/>
+                <w:sz w:val="20"/>
+                <w:szCs w:val="20"/>
+              </w:rPr>
+            </w:pPr>
+            <w:r>
+              <w:rPr>
+                <w:rFonts w:ascii="Consolas" w:hAnsi="Consolas"/>
+                <w:sz w:val="20"/>
+                <w:szCs w:val="20"/>
+              </w:rPr>
+              <w:t xml:space="preserve"> "Abstract":"LLM" OR "Abstract":"Large Language Model" OR "Abstract":"GenAI" OR "Abstract":"Generative AI" OR</w:t>
+            </w:r>
+          </w:p>
+          <w:p>
+            <w:pPr>
+              <w:jc w:val="both"/>
+              <w:rPr>
+                <w:rFonts w:ascii="Consolas" w:hAnsi="Consolas"/>
+                <w:sz w:val="20"/>
+                <w:szCs w:val="20"/>
+              </w:rPr>
+            </w:pPr>
+            <w:r>
+              <w:rPr>
+                <w:rFonts w:ascii="Consolas" w:hAnsi="Consolas"/>
+                <w:sz w:val="20"/>
+                <w:szCs w:val="20"/>
+              </w:rPr>
+              <w:t xml:space="preserve"> "Author Keywords":"LLM" OR "Author Keywords":"Large Language Model" OR "Author Keywords":"GenAI" OR "Author Keywords":"Generative AI")</w:t>
             </w:r>
           </w:p>
         </w:tc>
       </w:tr>
+    </w:tbl>
+    <w:p>
+      <w:pPr>
+        <w:jc w:val="both"/>
+      </w:pPr>
+    </w:p>
+    <w:p/>
+    <w:p>
+      <w:pPr>
+        <w:rPr>
+          <w:b/>
+          <w:bCs/>
+        </w:rPr>
+      </w:pPr>
+      <w:r>
+        <w:rPr>
+          <w:b/>
+          <w:bCs/>
+        </w:rPr>
+        <w:t>5.3. Scopus</w:t>
+      </w:r>
+    </w:p>
+    <w:p/>
+    <w:p>
+      <w:pPr>
+        <w:jc w:val="both"/>
+      </w:pPr>
+      <w:r>
+        <w:t xml:space="preserve">Disponível em </w:t>
+      </w:r>
+      <w:hyperlink r:id="rId8" w:history="1">
+        <w:r>
+          <w:rPr>
+            <w:rStyle w:val="Hyperlink"/>
+          </w:rPr>
+          <w:t>https://www.scopus.com/</w:t>
+        </w:r>
+      </w:hyperlink>
+      <w:r>
+        <w:t xml:space="preserve">, </w:t>
+      </w:r>
+      <w:r>
+        <w:t>é a b</w:t>
+      </w:r>
+      <w:r>
+        <w:t>ase multidisciplinar da Elsevier com ampla cobertura de Engenharia de Software,</w:t>
+      </w:r>
+      <w:r>
+        <w:t xml:space="preserve"> inclusive,</w:t>
+      </w:r>
+      <w:r>
+        <w:t xml:space="preserve"> </w:t>
+      </w:r>
+      <w:r>
+        <w:t>indexando</w:t>
+      </w:r>
+      <w:r>
+        <w:t xml:space="preserve"> publicações </w:t>
+      </w:r>
+      <w:r>
+        <w:t xml:space="preserve">da </w:t>
+      </w:r>
+      <w:r>
+        <w:t>ACM</w:t>
+      </w:r>
+      <w:r>
+        <w:t xml:space="preserve"> e IEEE</w:t>
+      </w:r>
+      <w:r>
+        <w:t>. Possui índice de citações e ferramentas de análise bibliométrica, além de suporte a exportação estruturada</w:t>
+      </w:r>
+      <w:r>
+        <w:t>,</w:t>
+      </w:r>
+      <w:r>
+        <w:t xml:space="preserve"> fundamentais para a condução sistemática e reproduzível da busca.</w:t>
+      </w:r>
+    </w:p>
+    <w:p>
+      <w:pPr>
+        <w:rPr>
+          <w:b/>
+          <w:bCs/>
+        </w:rPr>
+      </w:pPr>
+    </w:p>
+    <w:p>
+      <w:pPr>
+        <w:jc w:val="both"/>
+        <w:rPr>
+          <w:b/>
+          <w:bCs/>
+        </w:rPr>
+      </w:pPr>
+      <w:r>
+        <w:rPr>
+          <w:b/>
+          <w:bCs/>
+        </w:rPr>
+        <w:t>5.</w:t>
+      </w:r>
+      <w:r>
+        <w:rPr>
+          <w:b/>
+          <w:bCs/>
+        </w:rPr>
+        <w:t>3</w:t>
+      </w:r>
+      <w:r>
+        <w:rPr>
+          <w:b/>
+          <w:bCs/>
+        </w:rPr>
+        <w:t>.1. String adaptada para sintaxe</w:t>
+      </w:r>
+      <w:r>
+        <w:rPr>
+          <w:b/>
+          <w:bCs/>
+        </w:rPr>
+        <w:t xml:space="preserve"> de busca</w:t>
+      </w:r>
+      <w:r>
+        <w:rPr>
+          <w:b/>
+          <w:bCs/>
+        </w:rPr>
+        <w:t xml:space="preserve"> específica </w:t>
+      </w:r>
+      <w:r>
+        <w:rPr>
+          <w:b/>
+          <w:bCs/>
+        </w:rPr>
+        <w:t>n</w:t>
+      </w:r>
+      <w:r>
+        <w:rPr>
+          <w:b/>
+          <w:bCs/>
+        </w:rPr>
+        <w:t xml:space="preserve">o </w:t>
+      </w:r>
+      <w:r>
+        <w:rPr>
+          <w:b/>
+          <w:bCs/>
+        </w:rPr>
+        <w:t>Scopus</w:t>
+      </w:r>
+    </w:p>
+    <w:p>
+      <w:pPr>
+        <w:rPr>
+          <w:b/>
+          <w:bCs/>
+        </w:rPr>
+      </w:pPr>
+    </w:p>
+    <w:tbl>
+      <w:tblPr>
+        <w:tblStyle w:val="Tabelacomgrade"/>
+        <w:tblW w:w="0" w:type="auto"/>
+        <w:tblLook w:val="04A0" w:firstRow="1" w:lastRow="0" w:firstColumn="1" w:lastColumn="0" w:noHBand="0" w:noVBand="1"/>
+      </w:tblPr>
+      <w:tblGrid>
+        <w:gridCol w:w="9019"/>
+      </w:tblGrid>
       <w:tr>
         <w:tc>
           <w:tcPr>
-            <w:tcW w:w="3006" w:type="dxa"/>
+            <w:tcW w:w="9019" w:type="dxa"/>
+            <w:shd w:val="clear" w:color="auto" w:fill="F2F2F2" w:themeFill="background1" w:themeFillShade="F2"/>
           </w:tcPr>
           <w:p>
-            <w:r>
-              <w:t>ACM Digital Library</w:t>
-            </w:r>
-          </w:p>
-        </w:tc>
-        <w:tc>
-          <w:tcPr>
-            <w:tcW w:w="3006" w:type="dxa"/>
-          </w:tcPr>
-          <w:p>
-            <w:r>
-              <w:t>https://dl.acm.org/</w:t>
-            </w:r>
-          </w:p>
-        </w:tc>
-        <w:tc>
-          <w:tcPr>
-            <w:tcW w:w="3007" w:type="dxa"/>
-          </w:tcPr>
-          <w:p>
             <w:pPr>
-              <w:jc w:val="both"/>
+              <w:rPr>
+                <w:rFonts w:ascii="Consolas" w:hAnsi="Consolas"/>
+                <w:sz w:val="20"/>
+                <w:szCs w:val="20"/>
+              </w:rPr>
             </w:pPr>
             <w:r>
-              <w:t xml:space="preserve">Principal repositório de publicações da Association for Computing Machinery (ACM), com cobertura abrangente de Engenharia de Software e áreas correlatas. Indexa venues de alto impacto como ESEC/FSE, ISSTA, ICSE (co-publicada com IEEE) e periódicos como TOSEM e CACM. Oferece busca avançada com operadores booleanos e exportação estruturada em BibTeX </w:t>
-            </w:r>
-            <w:r>
-              <w:t>-</w:t>
-            </w:r>
-            <w:r>
-              <w:t xml:space="preserve"> fundamentais para a condução sistemática e reproduzível da busca.</w:t>
-            </w:r>
-          </w:p>
-        </w:tc>
-      </w:tr>
-      <w:tr>
-        <w:tc>
-          <w:tcPr>
-            <w:tcW w:w="3006" w:type="dxa"/>
-          </w:tcPr>
-          <w:p>
-            <w:r>
-              <w:t>IEEE Xplore</w:t>
-            </w:r>
-          </w:p>
-        </w:tc>
-        <w:tc>
-          <w:tcPr>
-            <w:tcW w:w="3006" w:type="dxa"/>
-          </w:tcPr>
-          <w:p>
-            <w:r>
-              <w:t>https://ieeexplore.ieee.org/</w:t>
-            </w:r>
-          </w:p>
-        </w:tc>
-        <w:tc>
-          <w:tcPr>
-            <w:tcW w:w="3007" w:type="dxa"/>
-          </w:tcPr>
+              <w:rPr>
+                <w:rFonts w:ascii="Consolas" w:hAnsi="Consolas"/>
+                <w:sz w:val="20"/>
+                <w:szCs w:val="20"/>
+              </w:rPr>
+              <w:t>TITLE-ABS-KEY("source code" OR "source codes" OR "codebase" OR "code repository" OR "code search")</w:t>
+            </w:r>
+          </w:p>
           <w:p>
             <w:pPr>
-              <w:jc w:val="both"/>
+              <w:rPr>
+                <w:rFonts w:ascii="Consolas" w:hAnsi="Consolas"/>
+                <w:sz w:val="20"/>
+                <w:szCs w:val="20"/>
+              </w:rPr>
             </w:pPr>
             <w:r>
-              <w:t>Principal repositório de publicações IEEE e IET em Engenharia de Software, Computação e áreas afins. Indexa conferências de alto impacto como ICSE, ASE, SANER e MSR, além dos principais periódicos da área (e.g., IEEE TSE, IEEE Software). Oferece busca avançada com exportação em CSV/BibTeX.</w:t>
-            </w:r>
-          </w:p>
-        </w:tc>
-      </w:tr>
-      <w:tr>
-        <w:tc>
-          <w:tcPr>
-            <w:tcW w:w="3006" w:type="dxa"/>
-          </w:tcPr>
-          <w:p>
-            <w:r>
-              <w:t>Scopus</w:t>
-            </w:r>
-          </w:p>
-        </w:tc>
-        <w:tc>
-          <w:tcPr>
-            <w:tcW w:w="3006" w:type="dxa"/>
-          </w:tcPr>
-          <w:p>
-            <w:r>
-              <w:t>https://www.scopus.com/</w:t>
-            </w:r>
-          </w:p>
-        </w:tc>
-        <w:tc>
-          <w:tcPr>
-            <w:tcW w:w="3007" w:type="dxa"/>
-          </w:tcPr>
+              <w:rPr>
+                <w:rFonts w:ascii="Consolas" w:hAnsi="Consolas"/>
+                <w:sz w:val="20"/>
+                <w:szCs w:val="20"/>
+              </w:rPr>
+              <w:t>AND TITLE-ABS-KEY("Retrieval-Augmented Generation" OR "Retrieval Augmented Generation" OR "RAG")</w:t>
+            </w:r>
+          </w:p>
           <w:p>
             <w:pPr>
-              <w:jc w:val="both"/>
+              <w:rPr>
+                <w:rFonts w:ascii="Consolas" w:hAnsi="Consolas"/>
+                <w:sz w:val="20"/>
+                <w:szCs w:val="20"/>
+              </w:rPr>
             </w:pPr>
             <w:r>
-              <w:t>Base multidisciplinar da Elsevier com ampla cobertura de Engenharia de Software, incluindo publicações ACM, Springer e Elsevier. Possui índice de citações e ferramentas de análise bibliométrica, além de suporte a exportação estruturada — fundamentais para a condução sistemática e reproduzível da busca.</w:t>
+              <w:rPr>
+                <w:rFonts w:ascii="Consolas" w:hAnsi="Consolas"/>
+                <w:sz w:val="20"/>
+                <w:szCs w:val="20"/>
+              </w:rPr>
+              <w:t>AND TITLE-ABS-KEY("LLM" OR "Large Language Model" OR "GenAI" OR "Generative AI")</w:t>
             </w:r>
           </w:p>
         </w:tc>
@@ -2061,47 +2921,93 @@
     </w:tbl>
     <w:p>
       <w:pPr>
-        <w:jc w:val="both"/>
-      </w:pPr>
-    </w:p>
-    <w:p>
-      <w:r>
+        <w:rPr>
+          <w:b/>
+          <w:bCs/>
+        </w:rPr>
+      </w:pPr>
+    </w:p>
+    <w:p>
+      <w:pPr>
+        <w:jc w:val="both"/>
+      </w:pPr>
+    </w:p>
+    <w:p>
+      <w:pPr>
         <w:rPr>
           <w:i/>
           <w:iCs/>
         </w:rPr>
-        <w:t xml:space="preserve">Observação: As bases selecionadas apresentam sobreposição intencional de cobertura. O Scopus indexa publicações da ACM e do IEEE, podendo duplicar resultados já retornados pela ACM Digital Library e pelo IEEE Xplore. Adicionalmente, alguns venues são co-publicados por mais de uma editora </w:t>
-      </w:r>
+      </w:pPr>
       <w:r>
         <w:rPr>
           <w:i/>
           <w:iCs/>
         </w:rPr>
-        <w:t>(</w:t>
+        <w:t xml:space="preserve">Observação: As bases selecionadas apresentam sobreposição intencional de cobertura. O Scopus indexa publicações da ACM e do IEEE, podendo duplicar resultados já retornados pela ACM Digital Library e pelo IEEE Xplore. Adicionalmente, alguns venues são co-publicados por mais de uma editora </w:t>
       </w:r>
       <w:r>
         <w:rPr>
           <w:i/>
           <w:iCs/>
         </w:rPr>
-        <w:t>notadamente o ICSE, co-publicado pela ACM e pelo IEEE</w:t>
+        <w:t>(</w:t>
       </w:r>
       <w:r>
         <w:rPr>
           <w:i/>
           <w:iCs/>
         </w:rPr>
-        <w:t>)</w:t>
+        <w:t>notadamente o ICSE, co-publicado pela ACM e pelo IEEE</w:t>
       </w:r>
       <w:r>
         <w:rPr>
           <w:i/>
           <w:iCs/>
         </w:rPr>
+        <w:t>)</w:t>
+      </w:r>
+      <w:r>
+        <w:rPr>
+          <w:i/>
+          <w:iCs/>
+        </w:rPr>
         <w:t>. Eventuais duplicatas resultantes da busca em múltiplas bases serão identificadas e tratadas conforme o critério CE3.</w:t>
       </w:r>
     </w:p>
     <w:p/>
+    <w:p>
+      <w:pPr>
+        <w:rPr>
+          <w:b/>
+          <w:bCs/>
+        </w:rPr>
+      </w:pPr>
+    </w:p>
+    <w:p>
+      <w:pPr>
+        <w:rPr>
+          <w:b/>
+          <w:bCs/>
+        </w:rPr>
+      </w:pPr>
+    </w:p>
+    <w:p>
+      <w:pPr>
+        <w:rPr>
+          <w:b/>
+          <w:bCs/>
+        </w:rPr>
+      </w:pPr>
+    </w:p>
+    <w:p>
+      <w:pPr>
+        <w:rPr>
+          <w:b/>
+          <w:bCs/>
+        </w:rPr>
+      </w:pPr>
+    </w:p>
     <w:p>
       <w:pPr>
         <w:rPr>
@@ -2542,7 +3448,25 @@
               <w:jc w:val="both"/>
             </w:pPr>
             <w:r>
-              <w:t>Literatura cinzenta: preprints, relatórios técnicos, whitepapers, posts e artigos sem revisão por pares formal.</w:t>
+              <w:t>Publicação que não seja artigo de periódico científico ou artigo de conferência com revisão por pares formal</w:t>
+            </w:r>
+            <w:r>
+              <w:t xml:space="preserve">: </w:t>
+            </w:r>
+            <w:r>
+              <w:t>preprints, relatórios técnicos, whitepapers, posts, capítulos de livro, livros, teses</w:t>
+            </w:r>
+            <w:r>
+              <w:t xml:space="preserve">, </w:t>
+            </w:r>
+            <w:r>
+              <w:t>dissertações</w:t>
+            </w:r>
+            <w:r>
+              <w:t>, etc</w:t>
+            </w:r>
+            <w:r>
+              <w:t>.</w:t>
             </w:r>
           </w:p>
         </w:tc>
@@ -2643,7 +3567,6 @@
           <w:b/>
           <w:bCs/>
         </w:rPr>
-        <w:lastRenderedPageBreak/>
         <w:t>7. PRISMA</w:t>
       </w:r>
     </w:p>
@@ -2886,7 +3809,6 @@
           <w:b/>
           <w:bCs/>
         </w:rPr>
-        <w:lastRenderedPageBreak/>
         <w:t>REFERÊNCIAS</w:t>
       </w:r>
     </w:p>
@@ -4190,7 +5112,7 @@
   <w:style w:type="paragraph" w:default="1" w:styleId="Normal">
     <w:name w:val="Normal"/>
     <w:qFormat/>
-    <w:rsid w:val="00A729D0"/>
+    <w:rsid w:val="001E7D6F"/>
   </w:style>
   <w:style w:type="paragraph" w:styleId="Ttulo1">
     <w:name w:val="heading 1"/>
@@ -4309,7 +5231,6 @@
   <w:style w:type="character" w:default="1" w:styleId="Fontepargpadro">
     <w:name w:val="Default Paragraph Font"/>
     <w:uiPriority w:val="1"/>
-    <w:semiHidden/>
     <w:unhideWhenUsed/>
   </w:style>
   <w:style w:type="table" w:default="1" w:styleId="Tabelanormal">
@@ -4777,4 +5698,16 @@
   </a:objectDefaults>
   <a:extraClrSchemeLst/>
 </a:theme>
+</file>
+
+<file path=customXml/item1.xml><?xml version="1.0" encoding="utf-8"?>
+<b:Sources xmlns:b="http://schemas.openxmlformats.org/officeDocument/2006/bibliography" xmlns="http://schemas.openxmlformats.org/officeDocument/2006/bibliography" SelectedStyle="\APASixthEditionOfficeOnline.xsl" StyleName="APA" Version="6"/>
+</file>
+
+<file path=customXml/itemProps1.xml><?xml version="1.0" encoding="utf-8"?>
+<ds:datastoreItem xmlns:ds="http://schemas.openxmlformats.org/officeDocument/2006/customXml" ds:itemID="{1F7B2014-6258-4928-8C22-9D15AAF27367}">
+  <ds:schemaRefs>
+    <ds:schemaRef ds:uri="http://schemas.openxmlformats.org/officeDocument/2006/bibliography"/>
+  </ds:schemaRefs>
+</ds:datastoreItem>
 </file>
</xml_diff>

<commit_message>
Branch: main; Updated research protocol
</commit_message>
<xml_diff>
--- a/research_protocol/protocol.docx
+++ b/research_protocol/protocol.docx
@@ -1736,13 +1736,13 @@
         <w:tblLook w:val="04A0" w:firstRow="1" w:lastRow="0" w:firstColumn="1" w:lastColumn="0" w:noHBand="0" w:noVBand="1"/>
       </w:tblPr>
       <w:tblGrid>
-        <w:gridCol w:w="4509"/>
-        <w:gridCol w:w="4510"/>
+        <w:gridCol w:w="2405"/>
+        <w:gridCol w:w="6614"/>
       </w:tblGrid>
       <w:tr>
         <w:tc>
           <w:tcPr>
-            <w:tcW w:w="4509" w:type="dxa"/>
+            <w:tcW w:w="2405" w:type="dxa"/>
           </w:tcPr>
           <w:p>
             <w:pPr>
@@ -1762,7 +1762,7 @@
         </w:tc>
         <w:tc>
           <w:tcPr>
-            <w:tcW w:w="4510" w:type="dxa"/>
+            <w:tcW w:w="6614" w:type="dxa"/>
           </w:tcPr>
           <w:p>
             <w:pPr>
@@ -1784,7 +1784,7 @@
       <w:tr>
         <w:tc>
           <w:tcPr>
-            <w:tcW w:w="4509" w:type="dxa"/>
+            <w:tcW w:w="2405" w:type="dxa"/>
           </w:tcPr>
           <w:p>
             <w:r>
@@ -1795,13 +1795,13 @@
               <w:t>P</w:t>
             </w:r>
             <w:r>
-              <w:t xml:space="preserve"> - População</w:t>
+              <w:t>opulação</w:t>
             </w:r>
           </w:p>
         </w:tc>
         <w:tc>
           <w:tcPr>
-            <w:tcW w:w="4510" w:type="dxa"/>
+            <w:tcW w:w="6614" w:type="dxa"/>
           </w:tcPr>
           <w:p>
             <w:pPr>
@@ -1836,7 +1836,7 @@
       <w:tr>
         <w:tc>
           <w:tcPr>
-            <w:tcW w:w="4509" w:type="dxa"/>
+            <w:tcW w:w="2405" w:type="dxa"/>
           </w:tcPr>
           <w:p>
             <w:r>
@@ -1847,13 +1847,13 @@
               <w:t>I</w:t>
             </w:r>
             <w:r>
-              <w:t xml:space="preserve"> - Intervenção</w:t>
+              <w:t>ntervenção</w:t>
             </w:r>
           </w:p>
         </w:tc>
         <w:tc>
           <w:tcPr>
-            <w:tcW w:w="4510" w:type="dxa"/>
+            <w:tcW w:w="6614" w:type="dxa"/>
           </w:tcPr>
           <w:p>
             <w:pPr>
@@ -1876,7 +1876,7 @@
       <w:tr>
         <w:tc>
           <w:tcPr>
-            <w:tcW w:w="4509" w:type="dxa"/>
+            <w:tcW w:w="2405" w:type="dxa"/>
           </w:tcPr>
           <w:p>
             <w:r>
@@ -1887,13 +1887,13 @@
               <w:t>C</w:t>
             </w:r>
             <w:r>
-              <w:t xml:space="preserve"> - Comparação</w:t>
+              <w:t>omparação</w:t>
             </w:r>
           </w:p>
         </w:tc>
         <w:tc>
           <w:tcPr>
-            <w:tcW w:w="4510" w:type="dxa"/>
+            <w:tcW w:w="6614" w:type="dxa"/>
           </w:tcPr>
           <w:p>
             <w:pPr>
@@ -1912,7 +1912,13 @@
               <w:t>O</w:t>
             </w:r>
             <w:r>
-              <w:t xml:space="preserve"> mapeamento não pressupõe um grupo controle</w:t>
+              <w:t xml:space="preserve"> mapeamento</w:t>
+            </w:r>
+            <w:r>
+              <w:t xml:space="preserve"> sistemático</w:t>
+            </w:r>
+            <w:r>
+              <w:t xml:space="preserve"> não pressupõe um grupo controle</w:t>
             </w:r>
             <w:r>
               <w:t>;</w:t>
@@ -1932,9 +1938,10 @@
       <w:tr>
         <w:tc>
           <w:tcPr>
-            <w:tcW w:w="4509" w:type="dxa"/>
+            <w:tcW w:w="2405" w:type="dxa"/>
           </w:tcPr>
           <w:p>
+            <w:proofErr w:type="spellStart"/>
             <w:r>
               <w:rPr>
                 <w:b/>
@@ -1943,11 +1950,7 @@
               <w:t>O</w:t>
             </w:r>
             <w:r>
-              <w:t xml:space="preserve"> - </w:t>
-            </w:r>
-            <w:proofErr w:type="spellStart"/>
-            <w:r>
-              <w:t>Outcome</w:t>
+              <w:t>utcome</w:t>
             </w:r>
             <w:proofErr w:type="spellEnd"/>
             <w:r>
@@ -1957,13 +1960,28 @@
         </w:tc>
         <w:tc>
           <w:tcPr>
-            <w:tcW w:w="4510" w:type="dxa"/>
+            <w:tcW w:w="6614" w:type="dxa"/>
           </w:tcPr>
           <w:p>
             <w:pPr>
               <w:jc w:val="both"/>
             </w:pPr>
             <w:r>
+              <w:t xml:space="preserve">Não compõe a </w:t>
+            </w:r>
+            <w:proofErr w:type="spellStart"/>
+            <w:r>
+              <w:t>string</w:t>
+            </w:r>
+            <w:proofErr w:type="spellEnd"/>
+            <w:r>
+              <w:t xml:space="preserve"> de busca. Em mapeamento sistemático representa o que será extraído dos estudos:</w:t>
+            </w:r>
+            <w:r>
+              <w:br/>
+              <w:t xml:space="preserve">- </w:t>
+            </w:r>
+            <w:r>
               <w:t>Técnicas e arquiteturas de RAG.</w:t>
             </w:r>
           </w:p>
@@ -1971,6 +1989,9 @@
             <w:pPr>
               <w:jc w:val="both"/>
             </w:pPr>
+            <w:r>
+              <w:t xml:space="preserve">- </w:t>
+            </w:r>
             <w:proofErr w:type="spellStart"/>
             <w:r>
               <w:t>LLMs</w:t>
@@ -1985,6 +2006,9 @@
               <w:jc w:val="both"/>
             </w:pPr>
             <w:r>
+              <w:t xml:space="preserve">- </w:t>
+            </w:r>
+            <w:r>
               <w:t>Linguagens de programação e tipos de sistemas estu</w:t>
             </w:r>
             <w:r>
@@ -1999,6 +2023,9 @@
               <w:jc w:val="both"/>
             </w:pPr>
             <w:r>
+              <w:t xml:space="preserve">- </w:t>
+            </w:r>
+            <w:r>
               <w:t>Métricas de avaliação.</w:t>
             </w:r>
           </w:p>
@@ -2006,6 +2033,9 @@
             <w:pPr>
               <w:jc w:val="both"/>
             </w:pPr>
+            <w:r>
+              <w:t xml:space="preserve">- </w:t>
+            </w:r>
             <w:r>
               <w:t>Lacunas de pesquisa.</w:t>
             </w:r>
@@ -2015,7 +2045,7 @@
       <w:tr>
         <w:tc>
           <w:tcPr>
-            <w:tcW w:w="4509" w:type="dxa"/>
+            <w:tcW w:w="2405" w:type="dxa"/>
           </w:tcPr>
           <w:p>
             <w:r>
@@ -2026,29 +2056,28 @@
               <w:t>C</w:t>
             </w:r>
             <w:r>
-              <w:t xml:space="preserve"> - Contexto</w:t>
+              <w:t>ontexto</w:t>
             </w:r>
           </w:p>
         </w:tc>
         <w:tc>
           <w:tcPr>
-            <w:tcW w:w="4510" w:type="dxa"/>
+            <w:tcW w:w="6614" w:type="dxa"/>
           </w:tcPr>
           <w:p>
             <w:pPr>
               <w:jc w:val="both"/>
             </w:pPr>
             <w:r>
-              <w:t xml:space="preserve">Estudos primários com revisão por pares </w:t>
-            </w:r>
-            <w:r>
-              <w:t>no domínio de</w:t>
-            </w:r>
-            <w:r>
-              <w:t xml:space="preserve"> Engenharia de Softwar</w:t>
-            </w:r>
-            <w:r>
-              <w:t>e, delimitado pelo foco em artefatos de código-fonte.</w:t>
+              <w:t xml:space="preserve">Não se aplica. Em mapeamentos sistemáticos, o contexto é tipicamente garantido pelos critérios de seleção, não pela </w:t>
+            </w:r>
+            <w:proofErr w:type="spellStart"/>
+            <w:r>
+              <w:t>string</w:t>
+            </w:r>
+            <w:proofErr w:type="spellEnd"/>
+            <w:r>
+              <w:t>: a delimitação ao domínio de Engenharia de Software é assegurada pelo CI1, e a exigência de revisão por pares é assegurada pelo CE5.</w:t>
             </w:r>
           </w:p>
         </w:tc>
@@ -2425,7 +2454,7 @@
           <w:i/>
           <w:iCs/>
         </w:rPr>
-        <w:t>ões</w:t>
+        <w:t>ão</w:t>
       </w:r>
       <w:r>
         <w:rPr>
@@ -2434,60 +2463,58 @@
         </w:rPr>
         <w:t xml:space="preserve">: </w:t>
       </w:r>
-    </w:p>
-    <w:p>
-      <w:pPr>
-        <w:jc w:val="both"/>
+      <w:r>
         <w:rPr>
           <w:i/>
           <w:iCs/>
         </w:rPr>
-      </w:pPr>
+        <w:t xml:space="preserve">Embora RAG e LLM componham conceitualmente a mesma Intervenção, eles são representados como dois grupos distintos conectados por AND na </w:t>
+      </w:r>
+      <w:proofErr w:type="spellStart"/>
       <w:r>
         <w:rPr>
           <w:i/>
           <w:iCs/>
         </w:rPr>
-        <w:t xml:space="preserve">- O “Resultado” não compõe a </w:t>
-      </w:r>
-      <w:proofErr w:type="spellStart"/>
+        <w:t>string</w:t>
+      </w:r>
+      <w:proofErr w:type="spellEnd"/>
       <w:r>
         <w:rPr>
           <w:i/>
           <w:iCs/>
         </w:rPr>
-        <w:t>string</w:t>
-      </w:r>
-      <w:proofErr w:type="spellEnd"/>
+        <w:t xml:space="preserve"> de busca. Essa decisão é intencional: o AND garante que apenas estudos que tratam explicitamente da combinação RAG+LLM sejam recuperados, excluindo trabalhos sobre RAG sem base em modelos de linguagem de grande escala e trabalhos sobre </w:t>
+      </w:r>
+      <w:proofErr w:type="spellStart"/>
       <w:r>
         <w:rPr>
           <w:i/>
           <w:iCs/>
         </w:rPr>
-        <w:t xml:space="preserve"> pois representa o que será extraído dos estudos, não um critério de busca.</w:t>
-      </w:r>
-    </w:p>
-    <w:p>
-      <w:pPr>
-        <w:jc w:val="both"/>
+        <w:t>LLMs</w:t>
+      </w:r>
+      <w:proofErr w:type="spellEnd"/>
+      <w:r>
         <w:rPr>
           <w:i/>
           <w:iCs/>
         </w:rPr>
-      </w:pPr>
+        <w:t xml:space="preserve"> aplicados a código sem componente de recuperação. Trata-se de uma escolha de precisão sobre sensibilidade. Está-se ciente de que artigos que referenciam modelos específicos (</w:t>
+      </w:r>
       <w:r>
         <w:rPr>
           <w:i/>
           <w:iCs/>
         </w:rPr>
-        <w:t xml:space="preserve">- </w:t>
+        <w:t>Ex.:</w:t>
       </w:r>
       <w:r>
         <w:rPr>
           <w:i/>
           <w:iCs/>
         </w:rPr>
-        <w:t xml:space="preserve">O "Contexto" não compõe a </w:t>
+        <w:t xml:space="preserve"> GPT, </w:t>
       </w:r>
       <w:proofErr w:type="spellStart"/>
       <w:r>
@@ -2495,7 +2522,7 @@
           <w:i/>
           <w:iCs/>
         </w:rPr>
-        <w:t>string</w:t>
+        <w:t>Llama</w:t>
       </w:r>
       <w:proofErr w:type="spellEnd"/>
       <w:r>
@@ -2503,30 +2530,30 @@
           <w:i/>
           <w:iCs/>
         </w:rPr>
-        <w:t xml:space="preserve"> de busca pois é garantido pelos critérios de seleção: a delimitação ao domínio de Engenharia de Software é assegurada pelo CI1, e a exigência de revisão por pares é assegurada pelo CE5.</w:t>
-      </w:r>
-    </w:p>
-    <w:p>
-      <w:pPr>
-        <w:jc w:val="both"/>
+        <w:t>, Gemini</w:t>
+      </w:r>
+      <w:r>
         <w:rPr>
           <w:i/>
           <w:iCs/>
         </w:rPr>
-      </w:pPr>
+        <w:t xml:space="preserve">, </w:t>
+      </w:r>
+      <w:proofErr w:type="gramStart"/>
       <w:r>
         <w:rPr>
           <w:i/>
           <w:iCs/>
         </w:rPr>
-        <w:t xml:space="preserve">- </w:t>
-      </w:r>
+        <w:t>Claude, etc.</w:t>
+      </w:r>
+      <w:proofErr w:type="gramEnd"/>
       <w:r>
         <w:rPr>
           <w:i/>
           <w:iCs/>
         </w:rPr>
-        <w:t xml:space="preserve">Embora RAG e LLM componham conceitualmente a mesma Intervenção, eles são representados como dois grupos distintos conectados por AND na </w:t>
+        <w:t xml:space="preserve">) sem empregar os termos "LLM" ou "Large </w:t>
       </w:r>
       <w:proofErr w:type="spellStart"/>
       <w:r>
@@ -2534,7 +2561,7 @@
           <w:i/>
           <w:iCs/>
         </w:rPr>
-        <w:t>string</w:t>
+        <w:t>Language</w:t>
       </w:r>
       <w:proofErr w:type="spellEnd"/>
       <w:r>
@@ -2542,7 +2569,7 @@
           <w:i/>
           <w:iCs/>
         </w:rPr>
-        <w:t xml:space="preserve"> de busca. Essa decisão é intencional: o AND garante que apenas estudos que tratam explicitamente da combinação RAG+LLM sejam recuperados, excluindo trabalhos sobre RAG sem base em modelos de linguagem de grande escala e trabalhos sobre </w:t>
+        <w:t xml:space="preserve"> Model" podem não ser recuperados; para mitigar parcialmente esse risco, o termo "</w:t>
       </w:r>
       <w:proofErr w:type="spellStart"/>
       <w:r>
@@ -2550,7 +2577,7 @@
           <w:i/>
           <w:iCs/>
         </w:rPr>
-        <w:t>LLMs</w:t>
+        <w:t>Generative</w:t>
       </w:r>
       <w:proofErr w:type="spellEnd"/>
       <w:r>
@@ -2558,85 +2585,16 @@
           <w:i/>
           <w:iCs/>
         </w:rPr>
-        <w:t xml:space="preserve"> aplicados a código sem componente de recuperação. Trata-se de uma escolha de precisão sobre sensibilidade. Está-se ciente de que artigos que referenciam modelos específicos (</w:t>
-      </w:r>
-      <w:r>
-        <w:rPr>
-          <w:i/>
-          <w:iCs/>
-        </w:rPr>
-        <w:t>Ex.:</w:t>
-      </w:r>
-      <w:r>
-        <w:rPr>
-          <w:i/>
-          <w:iCs/>
-        </w:rPr>
-        <w:t xml:space="preserve"> GPT, </w:t>
-      </w:r>
-      <w:proofErr w:type="spellStart"/>
-      <w:r>
-        <w:rPr>
-          <w:i/>
-          <w:iCs/>
-        </w:rPr>
-        <w:t>Llama</w:t>
-      </w:r>
-      <w:proofErr w:type="spellEnd"/>
-      <w:r>
-        <w:rPr>
-          <w:i/>
-          <w:iCs/>
-        </w:rPr>
-        <w:t>, Gemini</w:t>
-      </w:r>
-      <w:r>
-        <w:rPr>
-          <w:i/>
-          <w:iCs/>
-        </w:rPr>
-        <w:t>, Claude, etc.</w:t>
-      </w:r>
-      <w:r>
-        <w:rPr>
-          <w:i/>
-          <w:iCs/>
-        </w:rPr>
-        <w:t xml:space="preserve">) sem empregar os termos "LLM" ou "Large </w:t>
-      </w:r>
-      <w:proofErr w:type="spellStart"/>
-      <w:r>
-        <w:rPr>
-          <w:i/>
-          <w:iCs/>
-        </w:rPr>
-        <w:t>Language</w:t>
-      </w:r>
-      <w:proofErr w:type="spellEnd"/>
-      <w:r>
-        <w:rPr>
-          <w:i/>
-          <w:iCs/>
-        </w:rPr>
-        <w:t xml:space="preserve"> Model" podem não ser recuperados; para mitigar parcialmente esse risco, o termo "</w:t>
-      </w:r>
-      <w:proofErr w:type="spellStart"/>
-      <w:r>
-        <w:rPr>
-          <w:i/>
-          <w:iCs/>
-        </w:rPr>
-        <w:t>Generative</w:t>
-      </w:r>
-      <w:proofErr w:type="spellEnd"/>
-      <w:r>
-        <w:rPr>
-          <w:i/>
-          <w:iCs/>
-        </w:rPr>
         <w:t xml:space="preserve"> AI" foi incluído como hiperônimo de uso corrente na literatura, aumentando a chance de cobertura indireta desses modelos. Essa decisão é documentada aqui para fins de rastreabilidade e reprodutibilidade da busca.</w:t>
       </w:r>
     </w:p>
+    <w:p/>
+    <w:p/>
+    <w:p/>
+    <w:p/>
+    <w:p/>
+    <w:p/>
+    <w:p/>
     <w:p/>
     <w:p/>
     <w:p/>
@@ -6487,7 +6445,25 @@
                 <w:sz w:val="20"/>
                 <w:szCs w:val="20"/>
               </w:rPr>
-              <w:t>TITLE-ABS-KEY("</w:t>
+              <w:t>TITLE-ABS-</w:t>
+            </w:r>
+            <w:proofErr w:type="gramStart"/>
+            <w:r>
+              <w:rPr>
+                <w:rFonts w:ascii="Consolas" w:hAnsi="Consolas"/>
+                <w:sz w:val="20"/>
+                <w:szCs w:val="20"/>
+              </w:rPr>
+              <w:t>KEY(</w:t>
+            </w:r>
+            <w:proofErr w:type="gramEnd"/>
+            <w:r>
+              <w:rPr>
+                <w:rFonts w:ascii="Consolas" w:hAnsi="Consolas"/>
+                <w:sz w:val="20"/>
+                <w:szCs w:val="20"/>
+              </w:rPr>
+              <w:t>"</w:t>
             </w:r>
             <w:proofErr w:type="spellStart"/>
             <w:r>
@@ -6666,7 +6642,25 @@
                 <w:sz w:val="20"/>
                 <w:szCs w:val="20"/>
               </w:rPr>
-              <w:t>AND TITLE-ABS-KEY("</w:t>
+              <w:t>AND TITLE-ABS-</w:t>
+            </w:r>
+            <w:proofErr w:type="gramStart"/>
+            <w:r>
+              <w:rPr>
+                <w:rFonts w:ascii="Consolas" w:hAnsi="Consolas"/>
+                <w:sz w:val="20"/>
+                <w:szCs w:val="20"/>
+              </w:rPr>
+              <w:t>KEY(</w:t>
+            </w:r>
+            <w:proofErr w:type="gramEnd"/>
+            <w:r>
+              <w:rPr>
+                <w:rFonts w:ascii="Consolas" w:hAnsi="Consolas"/>
+                <w:sz w:val="20"/>
+                <w:szCs w:val="20"/>
+              </w:rPr>
+              <w:t>"</w:t>
             </w:r>
             <w:proofErr w:type="spellStart"/>
             <w:r>
@@ -6737,7 +6731,25 @@
                 <w:sz w:val="20"/>
                 <w:szCs w:val="20"/>
               </w:rPr>
-              <w:t xml:space="preserve">AND TITLE-ABS-KEY("LLM" OR "Large </w:t>
+              <w:t>AND TITLE-ABS-</w:t>
+            </w:r>
+            <w:proofErr w:type="gramStart"/>
+            <w:r>
+              <w:rPr>
+                <w:rFonts w:ascii="Consolas" w:hAnsi="Consolas"/>
+                <w:sz w:val="20"/>
+                <w:szCs w:val="20"/>
+              </w:rPr>
+              <w:t>KEY(</w:t>
+            </w:r>
+            <w:proofErr w:type="gramEnd"/>
+            <w:r>
+              <w:rPr>
+                <w:rFonts w:ascii="Consolas" w:hAnsi="Consolas"/>
+                <w:sz w:val="20"/>
+                <w:szCs w:val="20"/>
+              </w:rPr>
+              <w:t xml:space="preserve">"LLM" OR "Large </w:t>
             </w:r>
             <w:proofErr w:type="spellStart"/>
             <w:r>
@@ -7486,6 +7498,7 @@
             <w:r>
               <w:t xml:space="preserve">, </w:t>
             </w:r>
+            <w:proofErr w:type="gramStart"/>
             <w:r>
               <w:t>dissertações</w:t>
             </w:r>
@@ -7495,6 +7508,7 @@
             <w:r>
               <w:t>.</w:t>
             </w:r>
+            <w:proofErr w:type="gramEnd"/>
           </w:p>
         </w:tc>
       </w:tr>
@@ -8002,21 +8016,7 @@
           <w:b/>
           <w:bCs/>
         </w:rPr>
-        <w:t>8</w:t>
-      </w:r>
-      <w:r>
-        <w:rPr>
-          <w:b/>
-          <w:bCs/>
-        </w:rPr>
-        <w:t xml:space="preserve">. </w:t>
-      </w:r>
-      <w:r>
-        <w:rPr>
-          <w:b/>
-          <w:bCs/>
-        </w:rPr>
-        <w:t>AMEAÇAS À VALIDADE</w:t>
+        <w:t>8. AMEAÇAS À VALIDADE</w:t>
       </w:r>
     </w:p>
     <w:p>
@@ -8033,13 +8033,7 @@
         <w:jc w:val="both"/>
       </w:pPr>
       <w:r>
-        <w:t>As ameaças à validade identificadas neste estudo envolvem</w:t>
-      </w:r>
-      <w:r>
-        <w:t>:</w:t>
-      </w:r>
-      <w:r>
-        <w:t xml:space="preserve"> 1) a elaboração da </w:t>
+        <w:t xml:space="preserve">As ameaças à validade identificadas neste estudo envolvem: 1) a elaboração da </w:t>
       </w:r>
       <w:proofErr w:type="spellStart"/>
       <w:r>
@@ -8047,25 +8041,7 @@
       </w:r>
       <w:proofErr w:type="spellEnd"/>
       <w:r>
-        <w:t xml:space="preserve"> de busca</w:t>
-      </w:r>
-      <w:r>
-        <w:t>;</w:t>
-      </w:r>
-      <w:r>
-        <w:t xml:space="preserve"> 2) a possível ausência de estudos primários relevantes</w:t>
-      </w:r>
-      <w:r>
-        <w:t>;</w:t>
-      </w:r>
-      <w:r>
-        <w:t xml:space="preserve"> 3) a confiabilidade na seleção</w:t>
-      </w:r>
-      <w:r>
-        <w:t>;</w:t>
-      </w:r>
-      <w:r>
-        <w:t xml:space="preserve"> 4) a confiabilidade na extração de dados.</w:t>
+        <w:t xml:space="preserve"> de busca; 2) a possível ausência de estudos primários relevantes; 3) a confiabilidade na seleção; 4) a confiabilidade na extração de dados.</w:t>
       </w:r>
     </w:p>
     <w:p>
@@ -8098,13 +8074,7 @@
       </w:r>
       <w:proofErr w:type="spellEnd"/>
       <w:r>
-        <w:t xml:space="preserve"> AI" como hiperônimo, pela cobertura complementar das três bases selecionadas </w:t>
-      </w:r>
-      <w:r>
-        <w:t>(</w:t>
-      </w:r>
-      <w:r>
-        <w:t xml:space="preserve">ACM Digital Library, IEEE </w:t>
+        <w:t xml:space="preserve"> AI" como hiperônimo, pela cobertura complementar das três bases selecionadas (ACM Digital Library, IEEE </w:t>
       </w:r>
       <w:proofErr w:type="spellStart"/>
       <w:r>
@@ -8112,13 +8082,7 @@
       </w:r>
       <w:proofErr w:type="spellEnd"/>
       <w:r>
-        <w:t xml:space="preserve"> e Scopus</w:t>
-      </w:r>
-      <w:r>
-        <w:t>)</w:t>
-      </w:r>
-      <w:r>
-        <w:t xml:space="preserve"> e pelo fato de o Scopus indexar publicações das demais bases, ampliando a cobertura indireta.</w:t>
+        <w:t xml:space="preserve"> e Scopus) e pelo fato de o Scopus indexar publicações das demais bases, ampliando a cobertura indireta.</w:t>
       </w:r>
     </w:p>
     <w:p>
@@ -8154,7 +8118,15 @@
         <w:jc w:val="both"/>
       </w:pPr>
       <w:r>
-        <w:t xml:space="preserve">BASILI, Victor R.. Software </w:t>
+        <w:t xml:space="preserve">BASILI, Victor </w:t>
+      </w:r>
+      <w:proofErr w:type="gramStart"/>
+      <w:r>
+        <w:t>R..</w:t>
+      </w:r>
+      <w:proofErr w:type="gramEnd"/>
+      <w:r>
+        <w:t xml:space="preserve"> Software </w:t>
       </w:r>
       <w:proofErr w:type="spellStart"/>
       <w:r>
@@ -8305,7 +8277,15 @@
         <w:jc w:val="both"/>
       </w:pPr>
       <w:r>
-        <w:t xml:space="preserve">BASILI, Victor; WEISS, David M.. A </w:t>
+        <w:t xml:space="preserve">BASILI, Victor; WEISS, David </w:t>
+      </w:r>
+      <w:proofErr w:type="gramStart"/>
+      <w:r>
+        <w:t>M..</w:t>
+      </w:r>
+      <w:proofErr w:type="gramEnd"/>
+      <w:r>
+        <w:t xml:space="preserve"> A </w:t>
       </w:r>
       <w:proofErr w:type="spellStart"/>
       <w:r>
@@ -8447,13 +8427,7 @@
         <w:t>IEEE Software</w:t>
       </w:r>
       <w:r>
-        <w:t>, v. 22, n. 1, p. 58</w:t>
-      </w:r>
-      <w:r>
-        <w:t>-</w:t>
-      </w:r>
-      <w:r>
-        <w:t>65, 2005.</w:t>
+        <w:t>, v. 22, n. 1, p. 58-65, 2005.</w:t>
       </w:r>
     </w:p>
     <w:p>
@@ -8652,10 +8626,7 @@
       </w:r>
       <w:proofErr w:type="spellEnd"/>
       <w:r>
-        <w:t>; KUZNIARZ, Ludwik.</w:t>
-      </w:r>
-      <w:r>
-        <w:t xml:space="preserve"> </w:t>
+        <w:t xml:space="preserve">; KUZNIARZ, Ludwik. </w:t>
       </w:r>
       <w:proofErr w:type="spellStart"/>
       <w:r>

</xml_diff>

<commit_message>
Branch: main; Screening process completed
</commit_message>
<xml_diff>
--- a/research_protocol/protocol.docx
+++ b/research_protocol/protocol.docx
@@ -7633,10 +7633,28 @@
         <w:t xml:space="preserve"> nas bases</w:t>
       </w:r>
       <w:r>
-        <w:t xml:space="preserve"> em DD/MM/2026</w:t>
-      </w:r>
-      <w:r>
-        <w:t>. R</w:t>
+        <w:t xml:space="preserve"> em </w:t>
+      </w:r>
+      <w:r>
+        <w:t>02</w:t>
+      </w:r>
+      <w:r>
+        <w:t>/</w:t>
+      </w:r>
+      <w:r>
+        <w:t>06</w:t>
+      </w:r>
+      <w:r>
+        <w:t>/2026</w:t>
+      </w:r>
+      <w:r>
+        <w:t>,</w:t>
+      </w:r>
+      <w:r>
+        <w:t xml:space="preserve"> </w:t>
+      </w:r>
+      <w:r>
+        <w:t>r</w:t>
       </w:r>
       <w:r>
         <w:t>etorn</w:t>
@@ -7648,16 +7666,25 @@
         <w:t xml:space="preserve"> um total de </w:t>
       </w:r>
       <w:r>
-        <w:t>X</w:t>
-      </w:r>
-      <w:r>
-        <w:t xml:space="preserve"> registros brutos, distribuídos entre Scopus (n = </w:t>
-      </w:r>
-      <w:r>
-        <w:t>X</w:t>
-      </w:r>
-      <w:r>
-        <w:t xml:space="preserve">), IEEE </w:t>
+        <w:t>173</w:t>
+      </w:r>
+      <w:r>
+        <w:t xml:space="preserve"> registros brutos, distribuídos entre</w:t>
+      </w:r>
+      <w:r>
+        <w:t xml:space="preserve"> </w:t>
+      </w:r>
+      <w:r>
+        <w:t xml:space="preserve">ACM Digital Library (n = </w:t>
+      </w:r>
+      <w:r>
+        <w:t>18</w:t>
+      </w:r>
+      <w:r>
+        <w:t>)</w:t>
+      </w:r>
+      <w:r>
+        <w:t xml:space="preserve">, IEEE </w:t>
       </w:r>
       <w:proofErr w:type="spellStart"/>
       <w:r>
@@ -7668,16 +7695,25 @@
         <w:t xml:space="preserve"> (n = </w:t>
       </w:r>
       <w:r>
-        <w:t>X</w:t>
-      </w:r>
-      <w:r>
-        <w:t xml:space="preserve">) e ACM Digital Library (n = </w:t>
-      </w:r>
-      <w:r>
-        <w:t>X</w:t>
-      </w:r>
-      <w:r>
-        <w:t>). Para dar suporte ao gerenciamento e à seleção desses estudos, os metadados</w:t>
+        <w:t>39</w:t>
+      </w:r>
+      <w:r>
+        <w:t>)</w:t>
+      </w:r>
+      <w:r>
+        <w:t xml:space="preserve"> e </w:t>
+      </w:r>
+      <w:r>
+        <w:t xml:space="preserve">Scopus (n = </w:t>
+      </w:r>
+      <w:r>
+        <w:t>116</w:t>
+      </w:r>
+      <w:r>
+        <w:t>)</w:t>
+      </w:r>
+      <w:r>
+        <w:t>. Para dar suporte ao gerenciamento e à seleção desses estudos, os metadados</w:t>
       </w:r>
       <w:r>
         <w:t xml:space="preserve"> (.</w:t>
@@ -7699,19 +7735,184 @@
       </w:r>
       <w:proofErr w:type="spellEnd"/>
       <w:r>
-        <w:t xml:space="preserve"> (OUZZANI et al., 2016). Por meio das funcionalidades da ferramenta, foi executado o processo automatizado de detecção de similaridade, resultando na identificação e remoção de 32 registros duplicados, restando 108 artigos únicos para a etapa de triagem. Na sequência, realizou-se a análise preliminar de títulos e resumos dentro da plataforma, o que levou à exclusão de </w:t>
-      </w:r>
-      <w:r>
-        <w:t>Y</w:t>
-      </w:r>
-      <w:r>
-        <w:t xml:space="preserve"> estudos que não atendiam aos critérios de elegibilidade. Ao final desse funil de seleção, </w:t>
-      </w:r>
-      <w:r>
-        <w:t>Z</w:t>
-      </w:r>
-      <w:r>
-        <w:t xml:space="preserve"> estudos primários foram integralmente incluídos para a extração de dados e composição do mapeamento sistemático.</w:t>
+        <w:t xml:space="preserve"> (OUZZANI et al., 2016). Por meio das funcionalidades da ferramenta, foi executado o processo automatizado de detecção de similaridade, resultando na identificação e remoção de </w:t>
+      </w:r>
+      <w:r>
+        <w:t>43</w:t>
+      </w:r>
+      <w:r>
+        <w:t xml:space="preserve"> registros duplicados</w:t>
+      </w:r>
+      <w:r>
+        <w:t>.</w:t>
+      </w:r>
+      <w:r>
+        <w:t xml:space="preserve"> </w:t>
+      </w:r>
+      <w:r>
+        <w:t xml:space="preserve">Durante a triagem, foi identificado adicionalmente que o artigo "N-CATS: A Neural Network </w:t>
+      </w:r>
+      <w:proofErr w:type="spellStart"/>
+      <w:r>
+        <w:t>Classification</w:t>
+      </w:r>
+      <w:proofErr w:type="spellEnd"/>
+      <w:r>
+        <w:t xml:space="preserve"> </w:t>
+      </w:r>
+      <w:proofErr w:type="spellStart"/>
+      <w:r>
+        <w:t>Automatic</w:t>
+      </w:r>
+      <w:proofErr w:type="spellEnd"/>
+      <w:r>
+        <w:t xml:space="preserve"> </w:t>
+      </w:r>
+      <w:proofErr w:type="spellStart"/>
+      <w:r>
+        <w:t>Taxonomy</w:t>
+      </w:r>
+      <w:proofErr w:type="spellEnd"/>
+      <w:r>
+        <w:t xml:space="preserve"> System" constituía uma duplicata não detectada automaticamente</w:t>
+      </w:r>
+      <w:r>
+        <w:t xml:space="preserve"> (</w:t>
+      </w:r>
+      <w:r>
+        <w:t>totalizando 44 registros duplicados removidos e restando 129 artigos únicos para avaliação</w:t>
+      </w:r>
+      <w:r>
+        <w:t>)</w:t>
+      </w:r>
+      <w:r>
+        <w:t xml:space="preserve">. </w:t>
+      </w:r>
+      <w:r>
+        <w:t>A</w:t>
+      </w:r>
+      <w:r>
+        <w:t xml:space="preserve"> análise preliminar de títulos e resumos </w:t>
+      </w:r>
+      <w:r>
+        <w:t>l</w:t>
+      </w:r>
+      <w:r>
+        <w:t xml:space="preserve">evou à exclusão de </w:t>
+      </w:r>
+      <w:r>
+        <w:t>6</w:t>
+      </w:r>
+      <w:r>
+        <w:t>6</w:t>
+      </w:r>
+      <w:r>
+        <w:t xml:space="preserve"> estudos que não atendiam aos critérios de elegibilidade</w:t>
+      </w:r>
+      <w:r>
+        <w:t xml:space="preserve">, resultando em </w:t>
+      </w:r>
+      <w:r>
+        <w:t>63</w:t>
+      </w:r>
+      <w:r>
+        <w:t xml:space="preserve"> estudos primários</w:t>
+      </w:r>
+      <w:r>
+        <w:t xml:space="preserve"> </w:t>
+      </w:r>
+      <w:r>
+        <w:t>selecionados</w:t>
+      </w:r>
+      <w:r>
+        <w:t xml:space="preserve"> para extração de dados</w:t>
+      </w:r>
+      <w:r>
+        <w:t xml:space="preserve">, incluindo </w:t>
+      </w:r>
+      <w:r>
+        <w:t>um classificado como</w:t>
+      </w:r>
+      <w:r>
+        <w:t xml:space="preserve"> dúvida</w:t>
+      </w:r>
+      <w:r>
+        <w:t xml:space="preserve"> (</w:t>
+      </w:r>
+      <w:proofErr w:type="spellStart"/>
+      <w:r>
+        <w:t>Lighter</w:t>
+      </w:r>
+      <w:proofErr w:type="spellEnd"/>
+      <w:r>
+        <w:t xml:space="preserve"> </w:t>
+      </w:r>
+      <w:proofErr w:type="spellStart"/>
+      <w:r>
+        <w:t>And</w:t>
+      </w:r>
+      <w:proofErr w:type="spellEnd"/>
+      <w:r>
+        <w:t xml:space="preserve"> </w:t>
+      </w:r>
+      <w:proofErr w:type="spellStart"/>
+      <w:r>
+        <w:t>Better</w:t>
+      </w:r>
+      <w:proofErr w:type="spellEnd"/>
+      <w:r>
+        <w:t xml:space="preserve">: </w:t>
+      </w:r>
+      <w:proofErr w:type="spellStart"/>
+      <w:r>
+        <w:t>Towards</w:t>
+      </w:r>
+      <w:proofErr w:type="spellEnd"/>
+      <w:r>
+        <w:t xml:space="preserve"> </w:t>
+      </w:r>
+      <w:proofErr w:type="spellStart"/>
+      <w:r>
+        <w:t>Flexible</w:t>
+      </w:r>
+      <w:proofErr w:type="spellEnd"/>
+      <w:r>
+        <w:t xml:space="preserve"> </w:t>
+      </w:r>
+      <w:proofErr w:type="spellStart"/>
+      <w:r>
+        <w:t>Context</w:t>
+      </w:r>
+      <w:proofErr w:type="spellEnd"/>
+      <w:r>
+        <w:t xml:space="preserve"> </w:t>
+      </w:r>
+      <w:proofErr w:type="spellStart"/>
+      <w:r>
+        <w:t>Adaptation</w:t>
+      </w:r>
+      <w:proofErr w:type="spellEnd"/>
+      <w:r>
+        <w:t xml:space="preserve"> For </w:t>
+      </w:r>
+      <w:proofErr w:type="spellStart"/>
+      <w:r>
+        <w:t>Retrieval</w:t>
+      </w:r>
+      <w:proofErr w:type="spellEnd"/>
+      <w:r>
+        <w:t xml:space="preserve"> </w:t>
+      </w:r>
+      <w:proofErr w:type="spellStart"/>
+      <w:r>
+        <w:t>Augmented</w:t>
+      </w:r>
+      <w:proofErr w:type="spellEnd"/>
+      <w:r>
+        <w:t xml:space="preserve"> Generation</w:t>
+      </w:r>
+      <w:r>
+        <w:t>).</w:t>
       </w:r>
     </w:p>
     <w:p/>
@@ -7758,7 +7959,7 @@
         <w:t xml:space="preserve"> </w:t>
       </w:r>
       <w:r>
-        <w:t>X</w:t>
+        <w:t>173</w:t>
       </w:r>
       <w:r>
         <w:t xml:space="preserve"> registros importados.</w:t>
@@ -7773,33 +7974,13 @@
         <w:jc w:val="both"/>
       </w:pPr>
       <w:r>
-        <w:rPr>
-          <w:i/>
-          <w:iCs/>
-        </w:rPr>
-        <w:t xml:space="preserve">IEEE </w:t>
-      </w:r>
-      <w:proofErr w:type="spellStart"/>
-      <w:r>
-        <w:rPr>
-          <w:i/>
-          <w:iCs/>
-        </w:rPr>
-        <w:t>Xplore</w:t>
-      </w:r>
-      <w:proofErr w:type="spellEnd"/>
-      <w:r>
-        <w:rPr>
-          <w:i/>
-          <w:iCs/>
-        </w:rPr>
-        <w:t>:</w:t>
+        <w:t>ACM:</w:t>
       </w:r>
       <w:r>
         <w:t xml:space="preserve"> </w:t>
       </w:r>
       <w:r>
-        <w:t>X</w:t>
+        <w:t>18</w:t>
       </w:r>
     </w:p>
     <w:p>
@@ -7811,17 +7992,21 @@
         <w:jc w:val="both"/>
       </w:pPr>
       <w:r>
-        <w:rPr>
-          <w:i/>
-          <w:iCs/>
-        </w:rPr>
-        <w:t>Scopus:</w:t>
+        <w:t xml:space="preserve">IEEE </w:t>
+      </w:r>
+      <w:proofErr w:type="spellStart"/>
+      <w:r>
+        <w:t>Xplore</w:t>
+      </w:r>
+      <w:proofErr w:type="spellEnd"/>
+      <w:r>
+        <w:t>:</w:t>
       </w:r>
       <w:r>
         <w:t xml:space="preserve"> </w:t>
       </w:r>
       <w:r>
-        <w:t>X</w:t>
+        <w:t>39</w:t>
       </w:r>
     </w:p>
     <w:p>
@@ -7833,17 +8018,13 @@
         <w:jc w:val="both"/>
       </w:pPr>
       <w:r>
-        <w:rPr>
-          <w:i/>
-          <w:iCs/>
-        </w:rPr>
-        <w:t>ACM:</w:t>
+        <w:t>Scopus:</w:t>
       </w:r>
       <w:r>
         <w:t xml:space="preserve"> </w:t>
       </w:r>
       <w:r>
-        <w:t>X</w:t>
+        <w:t>116</w:t>
       </w:r>
     </w:p>
     <w:p>
@@ -7866,25 +8047,31 @@
         <w:t xml:space="preserve"> </w:t>
       </w:r>
       <w:r>
-        <w:t>X</w:t>
+        <w:t>4</w:t>
+      </w:r>
+      <w:r>
+        <w:t>4</w:t>
       </w:r>
       <w:r>
         <w:t xml:space="preserve"> registros deletados (</w:t>
       </w:r>
       <w:r>
-        <w:t>X</w:t>
+        <w:t>173</w:t>
       </w:r>
       <w:r>
         <w:t xml:space="preserve"> - </w:t>
       </w:r>
       <w:r>
-        <w:t>Y</w:t>
+        <w:t>4</w:t>
+      </w:r>
+      <w:r>
+        <w:t>4</w:t>
       </w:r>
       <w:r>
         <w:t xml:space="preserve"> = </w:t>
       </w:r>
       <w:r>
-        <w:t>Z</w:t>
+        <w:t>129</w:t>
       </w:r>
       <w:r>
         <w:t>).</w:t>
@@ -7926,7 +8113,10 @@
         <w:t xml:space="preserve"> </w:t>
       </w:r>
       <w:r>
-        <w:t>X</w:t>
+        <w:t>1</w:t>
+      </w:r>
+      <w:r>
+        <w:t>29</w:t>
       </w:r>
       <w:r>
         <w:t xml:space="preserve"> artigos avaliados (título/resumo).</w:t>
@@ -7952,10 +8142,76 @@
         <w:t xml:space="preserve"> </w:t>
       </w:r>
       <w:r>
-        <w:t>Y</w:t>
+        <w:t>6</w:t>
+      </w:r>
+      <w:r>
+        <w:t>6</w:t>
       </w:r>
       <w:r>
         <w:t xml:space="preserve"> artigos.</w:t>
+      </w:r>
+    </w:p>
+    <w:p>
+      <w:pPr>
+        <w:numPr>
+          <w:ilvl w:val="1"/>
+          <w:numId w:val="3"/>
+        </w:numPr>
+        <w:jc w:val="both"/>
+      </w:pPr>
+      <w:r>
+        <w:t>CE1</w:t>
+      </w:r>
+      <w:r>
+        <w:t>:</w:t>
+      </w:r>
+      <w:r>
+        <w:t xml:space="preserve"> </w:t>
+      </w:r>
+      <w:r>
+        <w:t>20</w:t>
+      </w:r>
+    </w:p>
+    <w:p>
+      <w:pPr>
+        <w:numPr>
+          <w:ilvl w:val="1"/>
+          <w:numId w:val="3"/>
+        </w:numPr>
+        <w:jc w:val="both"/>
+      </w:pPr>
+      <w:r>
+        <w:t>CE2</w:t>
+      </w:r>
+      <w:r>
+        <w:t>:</w:t>
+      </w:r>
+      <w:r>
+        <w:t xml:space="preserve"> </w:t>
+      </w:r>
+      <w:r>
+        <w:t>44</w:t>
+      </w:r>
+    </w:p>
+    <w:p>
+      <w:pPr>
+        <w:numPr>
+          <w:ilvl w:val="1"/>
+          <w:numId w:val="3"/>
+        </w:numPr>
+        <w:jc w:val="both"/>
+      </w:pPr>
+      <w:r>
+        <w:t>CE6</w:t>
+      </w:r>
+      <w:r>
+        <w:t>:</w:t>
+      </w:r>
+      <w:r>
+        <w:t xml:space="preserve"> </w:t>
+      </w:r>
+      <w:r>
+        <w:t>2</w:t>
       </w:r>
     </w:p>
     <w:p>
@@ -7978,122 +8234,268 @@
         <w:t xml:space="preserve"> </w:t>
       </w:r>
       <w:r>
-        <w:t>X</w:t>
+        <w:t>63</w:t>
       </w:r>
       <w:r>
         <w:t xml:space="preserve"> artigos restantes (</w:t>
       </w:r>
       <w:r>
-        <w:t>X</w:t>
+        <w:t>1</w:t>
+      </w:r>
+      <w:r>
+        <w:t>29</w:t>
       </w:r>
       <w:r>
         <w:t xml:space="preserve"> - </w:t>
       </w:r>
       <w:r>
-        <w:t>Y</w:t>
+        <w:t>66</w:t>
       </w:r>
       <w:r>
         <w:t xml:space="preserve"> = </w:t>
       </w:r>
       <w:r>
-        <w:t>Z</w:t>
+        <w:t>63</w:t>
+      </w:r>
+      <w:r>
+        <w:t xml:space="preserve">, incluindo 1 </w:t>
+      </w:r>
+      <w:r>
+        <w:t>classificado como</w:t>
+      </w:r>
+      <w:r>
+        <w:t xml:space="preserve"> dúvida</w:t>
       </w:r>
       <w:r>
         <w:t>).</w:t>
+      </w:r>
+    </w:p>
+    <w:p/>
+    <w:p>
+      <w:pPr>
+        <w:rPr>
+          <w:b/>
+          <w:bCs/>
+        </w:rPr>
+      </w:pPr>
+      <w:r>
+        <w:rPr>
+          <w:b/>
+          <w:bCs/>
+        </w:rPr>
+        <w:t>7.</w:t>
+      </w:r>
+      <w:r>
+        <w:rPr>
+          <w:b/>
+          <w:bCs/>
+        </w:rPr>
+        <w:t>2</w:t>
+      </w:r>
+      <w:r>
+        <w:rPr>
+          <w:b/>
+          <w:bCs/>
+        </w:rPr>
+        <w:t>.</w:t>
+      </w:r>
+      <w:r>
+        <w:rPr>
+          <w:b/>
+          <w:bCs/>
+        </w:rPr>
+        <w:t xml:space="preserve"> Diagrama</w:t>
+      </w:r>
+      <w:r>
+        <w:rPr>
+          <w:b/>
+          <w:bCs/>
+        </w:rPr>
+        <w:t xml:space="preserve"> PRISMA</w:t>
+      </w:r>
+    </w:p>
+    <w:p>
+      <w:pPr>
+        <w:rPr>
+          <w:b/>
+          <w:bCs/>
+        </w:rPr>
+      </w:pPr>
+    </w:p>
+    <w:p>
+      <w:r>
+        <w:rPr>
+          <w:noProof/>
+        </w:rPr>
+        <w:drawing>
+          <wp:inline distT="0" distB="0" distL="0" distR="0" wp14:anchorId="6905CC05" wp14:editId="743E2517">
+            <wp:extent cx="3375660" cy="2273068"/>
+            <wp:effectExtent l="0" t="0" r="0" b="0"/>
+            <wp:docPr id="199682056" name="Imagem 2"/>
+            <wp:cNvGraphicFramePr>
+              <a:graphicFrameLocks xmlns:a="http://schemas.openxmlformats.org/drawingml/2006/main" noChangeAspect="1"/>
+            </wp:cNvGraphicFramePr>
+            <a:graphic xmlns:a="http://schemas.openxmlformats.org/drawingml/2006/main">
+              <a:graphicData uri="http://schemas.openxmlformats.org/drawingml/2006/picture">
+                <pic:pic xmlns:pic="http://schemas.openxmlformats.org/drawingml/2006/picture">
+                  <pic:nvPicPr>
+                    <pic:cNvPr id="199682056" name="Imagem 199682056"/>
+                    <pic:cNvPicPr/>
+                  </pic:nvPicPr>
+                  <pic:blipFill>
+                    <a:blip r:embed="rId9" cstate="print">
+                      <a:extLst>
+                        <a:ext uri="{28A0092B-C50C-407E-A947-70E740481C1C}">
+                          <a14:useLocalDpi xmlns:a14="http://schemas.microsoft.com/office/drawing/2010/main" val="0"/>
+                        </a:ext>
+                      </a:extLst>
+                    </a:blip>
+                    <a:stretch>
+                      <a:fillRect/>
+                    </a:stretch>
+                  </pic:blipFill>
+                  <pic:spPr>
+                    <a:xfrm>
+                      <a:off x="0" y="0"/>
+                      <a:ext cx="3418172" cy="2301694"/>
+                    </a:xfrm>
+                    <a:prstGeom prst="rect">
+                      <a:avLst/>
+                    </a:prstGeom>
+                  </pic:spPr>
+                </pic:pic>
+              </a:graphicData>
+            </a:graphic>
+          </wp:inline>
+        </w:drawing>
+      </w:r>
+    </w:p>
+    <w:p/>
+    <w:p>
+      <w:pPr>
+        <w:rPr>
+          <w:b/>
+          <w:bCs/>
+        </w:rPr>
+      </w:pPr>
+    </w:p>
+    <w:p>
+      <w:pPr>
+        <w:rPr>
+          <w:b/>
+          <w:bCs/>
+        </w:rPr>
+      </w:pPr>
+      <w:r>
+        <w:rPr>
+          <w:b/>
+          <w:bCs/>
+        </w:rPr>
+        <w:lastRenderedPageBreak/>
+        <w:t>8. AMEAÇAS À VALIDADE</w:t>
+      </w:r>
+    </w:p>
+    <w:p>
+      <w:pPr>
+        <w:rPr>
+          <w:b/>
+          <w:bCs/>
+        </w:rPr>
+      </w:pPr>
+    </w:p>
+    <w:p>
+      <w:pPr>
+        <w:ind w:firstLine="720"/>
+        <w:jc w:val="both"/>
+      </w:pPr>
+      <w:r>
+        <w:t xml:space="preserve">As ameaças à validade identificadas neste estudo envolvem: 1) a elaboração da </w:t>
+      </w:r>
+      <w:proofErr w:type="spellStart"/>
+      <w:r>
+        <w:t>string</w:t>
+      </w:r>
+      <w:proofErr w:type="spellEnd"/>
+      <w:r>
+        <w:t xml:space="preserve"> de busca; 2) a possível ausência de estudos primários relevantes; 3) a confiabilidade na seleção; 4) a confiabilidade na extração de dados.</w:t>
+      </w:r>
+    </w:p>
+    <w:p>
+      <w:pPr>
+        <w:ind w:firstLine="720"/>
+        <w:jc w:val="both"/>
+      </w:pPr>
+      <w:r>
+        <w:t xml:space="preserve">Para mitigar a ameaça 1, a </w:t>
+      </w:r>
+      <w:proofErr w:type="spellStart"/>
+      <w:r>
+        <w:t>string</w:t>
+      </w:r>
+      <w:proofErr w:type="spellEnd"/>
+      <w:r>
+        <w:t xml:space="preserve"> de busca foi elaborada sistematicamente seguindo o framework PICOC (KITCHENHAM; CHARTERS, 2007), garantindo rastreabilidade entre os termos de busca e os objetivos da pesquisa. A ameaça 1 é diretamente relacionada à ameaça 2, uma vez que estudos relevantes podem não ter sido recuperados caso empreguem terminologia distinta da adotada na </w:t>
+      </w:r>
+      <w:proofErr w:type="spellStart"/>
+      <w:r>
+        <w:t>string</w:t>
+      </w:r>
+      <w:proofErr w:type="spellEnd"/>
+      <w:r>
+        <w:t xml:space="preserve"> canônica. Essa limitação é parcialmente atenuada pela inclusão do termo "</w:t>
+      </w:r>
+      <w:proofErr w:type="spellStart"/>
+      <w:r>
+        <w:t>Generative</w:t>
+      </w:r>
+      <w:proofErr w:type="spellEnd"/>
+      <w:r>
+        <w:t xml:space="preserve"> AI" como hiperônimo, pela cobertura complementar das três bases selecionadas (ACM Digital Library, IEEE </w:t>
+      </w:r>
+      <w:proofErr w:type="spellStart"/>
+      <w:r>
+        <w:t>Xplore</w:t>
+      </w:r>
+      <w:proofErr w:type="spellEnd"/>
+      <w:r>
+        <w:t xml:space="preserve"> e Scopus) e pelo fato de o Scopus indexar publicações das demais bases, ampliando a cobertura indireta.</w:t>
+      </w:r>
+    </w:p>
+    <w:p>
+      <w:pPr>
+        <w:ind w:firstLine="720"/>
+        <w:jc w:val="both"/>
+      </w:pPr>
+      <w:r>
+        <w:t>Com o objetivo de reduzir o impacto da ameaça 3, foram definidas questões de pesquisa estruturadas pelo framework GQM e derivados critérios explícitos de inclusão e exclusão, detalhados o suficiente para orientar decisões de triagem de forma objetiva e rastreável. Como limitação, reconhece-se que a condução por um único pesquisador pode introduzir viés nas etapas de triagem e extração de dados, caracterizando também a ameaça 4. A definição rigorosa dos critérios busca mitigar parcialmente esse risco, ainda que não o elimine integralmente.</w:t>
       </w:r>
     </w:p>
     <w:p/>
     <w:p/>
-    <w:p>
-      <w:pPr>
-        <w:rPr>
-          <w:b/>
-          <w:bCs/>
-        </w:rPr>
-      </w:pPr>
-      <w:r>
-        <w:rPr>
-          <w:b/>
-          <w:bCs/>
-        </w:rPr>
-        <w:t>8. AMEAÇAS À VALIDADE</w:t>
-      </w:r>
-    </w:p>
-    <w:p>
-      <w:pPr>
-        <w:rPr>
-          <w:b/>
-          <w:bCs/>
-        </w:rPr>
-      </w:pPr>
-    </w:p>
-    <w:p>
-      <w:pPr>
-        <w:ind w:firstLine="720"/>
-        <w:jc w:val="both"/>
-      </w:pPr>
-      <w:r>
-        <w:t xml:space="preserve">As ameaças à validade identificadas neste estudo envolvem: 1) a elaboração da </w:t>
-      </w:r>
-      <w:proofErr w:type="spellStart"/>
-      <w:r>
-        <w:t>string</w:t>
-      </w:r>
-      <w:proofErr w:type="spellEnd"/>
-      <w:r>
-        <w:t xml:space="preserve"> de busca; 2) a possível ausência de estudos primários relevantes; 3) a confiabilidade na seleção; 4) a confiabilidade na extração de dados.</w:t>
-      </w:r>
-    </w:p>
-    <w:p>
-      <w:pPr>
-        <w:ind w:firstLine="720"/>
-        <w:jc w:val="both"/>
-      </w:pPr>
-      <w:r>
-        <w:t xml:space="preserve">Para mitigar a ameaça 1, a </w:t>
-      </w:r>
-      <w:proofErr w:type="spellStart"/>
-      <w:r>
-        <w:t>string</w:t>
-      </w:r>
-      <w:proofErr w:type="spellEnd"/>
-      <w:r>
-        <w:t xml:space="preserve"> de busca foi elaborada sistematicamente seguindo o framework PICOC (KITCHENHAM; CHARTERS, 2007), garantindo rastreabilidade entre os termos de busca e os objetivos da pesquisa. A ameaça 1 é diretamente relacionada à ameaça 2, uma vez que estudos relevantes podem não ter sido recuperados caso empreguem terminologia distinta da adotada na </w:t>
-      </w:r>
-      <w:proofErr w:type="spellStart"/>
-      <w:r>
-        <w:t>string</w:t>
-      </w:r>
-      <w:proofErr w:type="spellEnd"/>
-      <w:r>
-        <w:t xml:space="preserve"> canônica. Essa limitação é parcialmente atenuada pela inclusão do termo "</w:t>
-      </w:r>
-      <w:proofErr w:type="spellStart"/>
-      <w:r>
-        <w:t>Generative</w:t>
-      </w:r>
-      <w:proofErr w:type="spellEnd"/>
-      <w:r>
-        <w:t xml:space="preserve"> AI" como hiperônimo, pela cobertura complementar das três bases selecionadas (ACM Digital Library, IEEE </w:t>
-      </w:r>
-      <w:proofErr w:type="spellStart"/>
-      <w:r>
-        <w:t>Xplore</w:t>
-      </w:r>
-      <w:proofErr w:type="spellEnd"/>
-      <w:r>
-        <w:t xml:space="preserve"> e Scopus) e pelo fato de o Scopus indexar publicações das demais bases, ampliando a cobertura indireta.</w:t>
-      </w:r>
-    </w:p>
-    <w:p>
-      <w:pPr>
-        <w:ind w:firstLine="720"/>
-        <w:jc w:val="both"/>
-      </w:pPr>
-      <w:r>
-        <w:t>Com o objetivo de reduzir o impacto da ameaça 3, foram definidas questões de pesquisa estruturadas pelo framework GQM e derivados critérios explícitos de inclusão e exclusão, detalhados o suficiente para orientar decisões de triagem de forma objetiva e rastreável. Como limitação, reconhece-se que a condução por um único pesquisador pode introduzir viés nas etapas de triagem e extração de dados, caracterizando também a ameaça 4. A definição rigorosa dos critérios busca mitigar parcialmente esse risco, ainda que não o elimine integralmente.</w:t>
-      </w:r>
-    </w:p>
+    <w:p/>
+    <w:p/>
+    <w:p/>
+    <w:p/>
+    <w:p/>
+    <w:p/>
+    <w:p/>
+    <w:p/>
+    <w:p/>
+    <w:p/>
+    <w:p/>
+    <w:p/>
+    <w:p/>
+    <w:p/>
+    <w:p/>
+    <w:p/>
+    <w:p/>
+    <w:p/>
+    <w:p/>
+    <w:p/>
+    <w:p/>
+    <w:p/>
+    <w:p/>
+    <w:p/>
     <w:p/>
     <w:p/>
     <w:p>
@@ -8747,7 +9149,7 @@
         <w:rFonts w:ascii="Symbol" w:hAnsi="Symbol" w:hint="default"/>
       </w:rPr>
     </w:lvl>
-    <w:lvl w:ilvl="1" w:tplc="04160003" w:tentative="1">
+    <w:lvl w:ilvl="1" w:tplc="04160003">
       <w:start w:val="1"/>
       <w:numFmt w:val="bullet"/>
       <w:lvlText w:val="o"/>
@@ -9152,7 +9554,7 @@
       <w:lvlText w:val="o"/>
       <w:lvlJc w:val="left"/>
       <w:pPr>
-        <w:ind w:left="1080" w:hanging="360"/>
+        <w:ind w:left="1440" w:hanging="360"/>
       </w:pPr>
       <w:rPr>
         <w:rFonts w:ascii="Courier New" w:hAnsi="Courier New" w:cs="Courier New" w:hint="default"/>
@@ -9164,7 +9566,7 @@
       <w:lvlText w:val="o"/>
       <w:lvlJc w:val="left"/>
       <w:pPr>
-        <w:ind w:left="1800" w:hanging="360"/>
+        <w:ind w:left="2160" w:hanging="360"/>
       </w:pPr>
       <w:rPr>
         <w:rFonts w:ascii="Courier New" w:hAnsi="Courier New" w:cs="Courier New" w:hint="default"/>
@@ -9176,7 +9578,7 @@
       <w:lvlText w:val=""/>
       <w:lvlJc w:val="left"/>
       <w:pPr>
-        <w:ind w:left="2520" w:hanging="360"/>
+        <w:ind w:left="2880" w:hanging="360"/>
       </w:pPr>
       <w:rPr>
         <w:rFonts w:ascii="Wingdings" w:hAnsi="Wingdings" w:hint="default"/>
@@ -9188,7 +9590,7 @@
       <w:lvlText w:val=""/>
       <w:lvlJc w:val="left"/>
       <w:pPr>
-        <w:ind w:left="3240" w:hanging="360"/>
+        <w:ind w:left="3600" w:hanging="360"/>
       </w:pPr>
       <w:rPr>
         <w:rFonts w:ascii="Symbol" w:hAnsi="Symbol" w:hint="default"/>
@@ -9200,7 +9602,7 @@
       <w:lvlText w:val="o"/>
       <w:lvlJc w:val="left"/>
       <w:pPr>
-        <w:ind w:left="3960" w:hanging="360"/>
+        <w:ind w:left="4320" w:hanging="360"/>
       </w:pPr>
       <w:rPr>
         <w:rFonts w:ascii="Courier New" w:hAnsi="Courier New" w:cs="Courier New" w:hint="default"/>
@@ -9212,7 +9614,7 @@
       <w:lvlText w:val=""/>
       <w:lvlJc w:val="left"/>
       <w:pPr>
-        <w:ind w:left="4680" w:hanging="360"/>
+        <w:ind w:left="5040" w:hanging="360"/>
       </w:pPr>
       <w:rPr>
         <w:rFonts w:ascii="Wingdings" w:hAnsi="Wingdings" w:hint="default"/>
@@ -9224,7 +9626,7 @@
       <w:lvlText w:val=""/>
       <w:lvlJc w:val="left"/>
       <w:pPr>
-        <w:ind w:left="5400" w:hanging="360"/>
+        <w:ind w:left="5760" w:hanging="360"/>
       </w:pPr>
       <w:rPr>
         <w:rFonts w:ascii="Symbol" w:hAnsi="Symbol" w:hint="default"/>
@@ -9236,7 +9638,7 @@
       <w:lvlText w:val="o"/>
       <w:lvlJc w:val="left"/>
       <w:pPr>
-        <w:ind w:left="6120" w:hanging="360"/>
+        <w:ind w:left="6480" w:hanging="360"/>
       </w:pPr>
       <w:rPr>
         <w:rFonts w:ascii="Courier New" w:hAnsi="Courier New" w:cs="Courier New" w:hint="default"/>
@@ -9248,7 +9650,7 @@
       <w:lvlText w:val=""/>
       <w:lvlJc w:val="left"/>
       <w:pPr>
-        <w:ind w:left="6840" w:hanging="360"/>
+        <w:ind w:left="7200" w:hanging="360"/>
       </w:pPr>
       <w:rPr>
         <w:rFonts w:ascii="Wingdings" w:hAnsi="Wingdings" w:hint="default"/>
@@ -9668,7 +10070,7 @@
   <w:style w:type="paragraph" w:default="1" w:styleId="Normal">
     <w:name w:val="Normal"/>
     <w:qFormat/>
-    <w:rsid w:val="00C87156"/>
+    <w:rsid w:val="001D3824"/>
   </w:style>
   <w:style w:type="paragraph" w:styleId="Ttulo1">
     <w:name w:val="heading 1"/>

</xml_diff>

<commit_message>
Branch: main; Removed article Code Reviews on a Budget: Memory-Efficient Fine-Tuning with QLoRA and RAG for Big Code Applications
</commit_message>
<xml_diff>
--- a/research_protocol/protocol.docx
+++ b/research_protocol/protocol.docx
@@ -3664,16 +3664,19 @@
         <w:t>6</w:t>
       </w:r>
       <w:r>
+        <w:t>8</w:t>
+      </w:r>
+      <w:r>
+        <w:t xml:space="preserve"> estudos que não atendiam aos critérios de elegibilidade</w:t>
+      </w:r>
+      <w:r>
+        <w:t xml:space="preserve">, resultando em </w:t>
+      </w:r>
+      <w:r>
         <w:t>6</w:t>
       </w:r>
       <w:r>
-        <w:t xml:space="preserve"> estudos que não atendiam aos critérios de elegibilidade</w:t>
-      </w:r>
-      <w:r>
-        <w:t xml:space="preserve">, resultando em </w:t>
-      </w:r>
-      <w:r>
-        <w:t>63</w:t>
+        <w:t>1</w:t>
       </w:r>
       <w:r>
         <w:t xml:space="preserve"> estudos primários</w:t>
@@ -3912,7 +3915,7 @@
         <w:t>6</w:t>
       </w:r>
       <w:r>
-        <w:t>7</w:t>
+        <w:t>8</w:t>
       </w:r>
       <w:r>
         <w:t xml:space="preserve"> artigos.</w:t>
@@ -3978,7 +3981,7 @@
         <w:t xml:space="preserve"> </w:t>
       </w:r>
       <w:r>
-        <w:t>3</w:t>
+        <w:t>4</w:t>
       </w:r>
     </w:p>
     <w:p>
@@ -4004,7 +4007,7 @@
         <w:t>6</w:t>
       </w:r>
       <w:r>
-        <w:t>2</w:t>
+        <w:t>1</w:t>
       </w:r>
       <w:r>
         <w:t xml:space="preserve"> artigos restantes (</w:t>
@@ -4022,7 +4025,7 @@
         <w:t>6</w:t>
       </w:r>
       <w:r>
-        <w:t>7</w:t>
+        <w:t>8</w:t>
       </w:r>
       <w:r>
         <w:t xml:space="preserve"> = </w:t>
@@ -4031,7 +4034,7 @@
         <w:t>6</w:t>
       </w:r>
       <w:r>
-        <w:t>2</w:t>
+        <w:t>1</w:t>
       </w:r>
       <w:r>
         <w:t xml:space="preserve">, incluindo 1 </w:t>

</xml_diff>

<commit_message>
Branch: main; Excluding inaccessible items
</commit_message>
<xml_diff>
--- a/research_protocol/protocol.docx
+++ b/research_protocol/protocol.docx
@@ -3463,6 +3463,42 @@
           </w:p>
         </w:tc>
       </w:tr>
+      <w:tr>
+        <w:tc>
+          <w:tcPr>
+            <w:tcW w:w="704" w:type="dxa"/>
+          </w:tcPr>
+          <w:p>
+            <w:pPr>
+              <w:jc w:val="center"/>
+              <w:rPr>
+                <w:b/>
+                <w:bCs/>
+              </w:rPr>
+            </w:pPr>
+            <w:r>
+              <w:rPr>
+                <w:b/>
+                <w:bCs/>
+              </w:rPr>
+              <w:t>CE8</w:t>
+            </w:r>
+          </w:p>
+        </w:tc>
+        <w:tc>
+          <w:tcPr>
+            <w:tcW w:w="8315" w:type="dxa"/>
+          </w:tcPr>
+          <w:p>
+            <w:pPr>
+              <w:jc w:val="both"/>
+            </w:pPr>
+            <w:r>
+              <w:t>Texto completo do artigo inacessível após busca nas bases institucionais (CAPES/UFG), Google Scholar e ResearchGate.</w:t>
+            </w:r>
+          </w:p>
+        </w:tc>
+      </w:tr>
     </w:tbl>
     <w:p/>
     <w:p>
@@ -3497,7 +3533,6 @@
     <w:p/>
     <w:p/>
     <w:p/>
-    <w:p/>
     <w:p>
       <w:pPr>
         <w:rPr>
@@ -3532,181 +3567,35 @@
     </w:p>
     <w:p>
       <w:pPr>
-        <w:jc w:val="both"/>
-      </w:pPr>
-      <w:r>
-        <w:t>A busca foi executada</w:t>
-      </w:r>
-      <w:r>
-        <w:t xml:space="preserve"> nas bases</w:t>
-      </w:r>
-      <w:r>
-        <w:t xml:space="preserve"> em </w:t>
-      </w:r>
-      <w:r>
-        <w:t>02</w:t>
-      </w:r>
-      <w:r>
-        <w:t>/</w:t>
-      </w:r>
-      <w:r>
-        <w:t>06</w:t>
-      </w:r>
-      <w:r>
-        <w:t>/2026</w:t>
-      </w:r>
-      <w:r>
-        <w:t>,</w:t>
-      </w:r>
-      <w:r>
-        <w:t xml:space="preserve"> </w:t>
-      </w:r>
-      <w:r>
-        <w:t>r</w:t>
-      </w:r>
-      <w:r>
-        <w:t>etorn</w:t>
-      </w:r>
-      <w:r>
-        <w:t>ando</w:t>
-      </w:r>
-      <w:r>
-        <w:t xml:space="preserve"> um total de </w:t>
-      </w:r>
-      <w:r>
-        <w:t>173</w:t>
-      </w:r>
-      <w:r>
-        <w:t xml:space="preserve"> registros brutos, distribuídos entre</w:t>
-      </w:r>
-      <w:r>
-        <w:t xml:space="preserve"> </w:t>
-      </w:r>
-      <w:r>
-        <w:t xml:space="preserve">ACM Digital Library (n = </w:t>
-      </w:r>
-      <w:r>
-        <w:t>18</w:t>
-      </w:r>
-      <w:r>
-        <w:t>)</w:t>
-      </w:r>
-      <w:r>
-        <w:t xml:space="preserve">, IEEE Xplore (n = </w:t>
-      </w:r>
-      <w:r>
-        <w:t>39</w:t>
-      </w:r>
-      <w:r>
-        <w:t>)</w:t>
-      </w:r>
-      <w:r>
-        <w:t xml:space="preserve"> e </w:t>
-      </w:r>
-      <w:r>
-        <w:t xml:space="preserve">Scopus (n = </w:t>
-      </w:r>
-      <w:r>
-        <w:t>116</w:t>
-      </w:r>
-      <w:r>
-        <w:t>)</w:t>
-      </w:r>
-      <w:r>
-        <w:t>. Para dar suporte ao gerenciamento e à seleção desses estudos, os metadados</w:t>
-      </w:r>
-      <w:r>
-        <w:t xml:space="preserve"> (.bib)</w:t>
-      </w:r>
-      <w:r>
-        <w:t xml:space="preserve"> foram importados para a plataforma Rayyan (OUZZANI et al., 2016). Por meio das funcionalidades da ferramenta, foi executado o processo automatizado de detecção de similaridade, resultando na identificação e remoção de </w:t>
-      </w:r>
-      <w:r>
-        <w:t>43</w:t>
-      </w:r>
-      <w:r>
-        <w:t xml:space="preserve"> registros duplicados</w:t>
-      </w:r>
-      <w:r>
-        <w:t>.</w:t>
-      </w:r>
-      <w:r>
-        <w:t xml:space="preserve"> </w:t>
-      </w:r>
-      <w:r>
-        <w:t>Durante a triagem, foi identificado adicionalmente que o artigo "N-CATS: A Neural Network Classification Automatic Taxonomy System" constituía uma duplicata não detectada automaticamente</w:t>
-      </w:r>
-      <w:r>
-        <w:t xml:space="preserve"> (</w:t>
-      </w:r>
-      <w:r>
-        <w:t>totalizando 44 registros duplicados removidos e restando 129 artigos únicos para avaliação</w:t>
-      </w:r>
-      <w:r>
-        <w:t>)</w:t>
-      </w:r>
-      <w:r>
-        <w:t xml:space="preserve">. </w:t>
-      </w:r>
-      <w:r>
-        <w:t>A</w:t>
-      </w:r>
-      <w:r>
-        <w:t xml:space="preserve"> análise preliminar de títulos e resumos </w:t>
-      </w:r>
-      <w:r>
-        <w:t>l</w:t>
-      </w:r>
-      <w:r>
-        <w:t xml:space="preserve">evou à exclusão de </w:t>
-      </w:r>
-      <w:r>
-        <w:t>6</w:t>
-      </w:r>
-      <w:r>
-        <w:t>8</w:t>
-      </w:r>
-      <w:r>
-        <w:t xml:space="preserve"> estudos que não atendiam aos critérios de elegibilidade</w:t>
-      </w:r>
-      <w:r>
-        <w:t xml:space="preserve">, resultando em </w:t>
-      </w:r>
-      <w:r>
-        <w:t>6</w:t>
-      </w:r>
-      <w:r>
-        <w:t>1</w:t>
-      </w:r>
-      <w:r>
-        <w:t xml:space="preserve"> estudos primários</w:t>
-      </w:r>
-      <w:r>
-        <w:t xml:space="preserve"> </w:t>
-      </w:r>
-      <w:r>
-        <w:t>selecionados</w:t>
-      </w:r>
-      <w:r>
-        <w:t xml:space="preserve"> para extração de dados</w:t>
-      </w:r>
-      <w:r>
-        <w:t xml:space="preserve">, incluindo </w:t>
-      </w:r>
-      <w:r>
-        <w:t>um classificado como</w:t>
-      </w:r>
-      <w:r>
-        <w:t xml:space="preserve"> dúvida</w:t>
-      </w:r>
-      <w:r>
-        <w:t xml:space="preserve"> (</w:t>
-      </w:r>
-      <w:r>
-        <w:t>Lighter And Better: Towards Flexible Context Adaptation For Retrieval Augmented Generation</w:t>
-      </w:r>
-      <w:r>
-        <w:t>).</w:t>
+        <w:ind w:firstLine="720"/>
+        <w:jc w:val="both"/>
+      </w:pPr>
+      <w:r>
+        <w:t>A busca foi executada nas bases em 02/06/2026, retornando um total de 173 registros brutos, distribuídos entre ACM Digital Library (n = 18), IEEE Xplore (n = 39) e Scopus (n = 116). Para dar suporte ao gerenciamento e à seleção desses estudos, os metadados (.bib) foram importados para a plataforma Rayyan (OUZZANI et al., 2016). Por meio das funcionalidades da ferramenta, foi executado o processo automatizado de detecção de similaridade, resultando na identificação e remoção de 43 registros duplicados. Durante a triagem, foi identificado adicionalmente que o artigo "N-CATS: A Neural Network Classification Automatic Taxonomy System" constituía uma duplicata não detectada automaticamente, totalizando 44 registros duplicados removidos e restando 129 artigos únicos para avaliação.</w:t>
+      </w:r>
+    </w:p>
+    <w:p>
+      <w:pPr>
+        <w:ind w:firstLine="720"/>
+        <w:jc w:val="both"/>
+      </w:pPr>
+      <w:r>
+        <w:t>A etapa de triagem consistiu na análise de títulos e resumos dos 129 artigos, levando à exclusão de 68 estudos que não atendiam aos critérios de elegibilidade (CE1: 20; CE2: 44; CE6: 4), resultando em 61 estudos encaminhados para a etapa de elegibilidade.</w:t>
+      </w:r>
+    </w:p>
+    <w:p>
+      <w:pPr>
+        <w:ind w:firstLine="720"/>
+        <w:jc w:val="both"/>
+      </w:pPr>
+      <w:r>
+        <w:t xml:space="preserve">Na etapa de elegibilidade, dos 61 estudos encaminhados, 4 foram excluídos previamente à leitura por inacessibilidade do texto completo após busca nas bases institucionais, Google Scholar e ResearchGate (CE8). Os 57 estudos restantes tiveram seus textos completos lidos integralmente, resultando na exclusão adicional de 1 artigo por não atender ao critério de foco principal em artefatos de código-fonte (Lighter And Better: Towards Flexible Context Adaptation For Retrieval Augmented Generation </w:t>
+      </w:r>
+      <w:r>
+        <w:t>-</w:t>
+      </w:r>
+      <w:r>
+        <w:t xml:space="preserve"> CE2). Ao final, 56 estudos primários foram selecionados para extração de dados e composição do mapeamento sistemático.</w:t>
       </w:r>
     </w:p>
     <w:p/>
@@ -3896,29 +3785,85 @@
       <w:pPr>
         <w:pStyle w:val="PargrafodaLista"/>
         <w:numPr>
-          <w:ilvl w:val="0"/>
+          <w:ilvl w:val="1"/>
           <w:numId w:val="3"/>
         </w:numPr>
         <w:jc w:val="both"/>
       </w:pPr>
       <w:r>
-        <w:rPr>
-          <w:b/>
-          <w:bCs/>
-        </w:rPr>
         <w:t>Excluídos na Triagem:</w:t>
       </w:r>
       <w:r>
         <w:t xml:space="preserve"> </w:t>
       </w:r>
       <w:r>
-        <w:t>6</w:t>
-      </w:r>
-      <w:r>
-        <w:t>8</w:t>
+        <w:t>68</w:t>
       </w:r>
       <w:r>
         <w:t xml:space="preserve"> artigos.</w:t>
+      </w:r>
+    </w:p>
+    <w:p>
+      <w:pPr>
+        <w:numPr>
+          <w:ilvl w:val="2"/>
+          <w:numId w:val="3"/>
+        </w:numPr>
+        <w:jc w:val="both"/>
+      </w:pPr>
+      <w:r>
+        <w:t>CE1</w:t>
+      </w:r>
+      <w:r>
+        <w:t>:</w:t>
+      </w:r>
+      <w:r>
+        <w:t xml:space="preserve"> </w:t>
+      </w:r>
+      <w:r>
+        <w:t>20</w:t>
+      </w:r>
+    </w:p>
+    <w:p>
+      <w:pPr>
+        <w:numPr>
+          <w:ilvl w:val="2"/>
+          <w:numId w:val="3"/>
+        </w:numPr>
+        <w:jc w:val="both"/>
+      </w:pPr>
+      <w:r>
+        <w:t>CE2</w:t>
+      </w:r>
+      <w:r>
+        <w:t>:</w:t>
+      </w:r>
+      <w:r>
+        <w:t xml:space="preserve"> </w:t>
+      </w:r>
+      <w:r>
+        <w:t>44</w:t>
+      </w:r>
+    </w:p>
+    <w:p>
+      <w:pPr>
+        <w:numPr>
+          <w:ilvl w:val="2"/>
+          <w:numId w:val="3"/>
+        </w:numPr>
+        <w:jc w:val="both"/>
+      </w:pPr>
+      <w:r>
+        <w:t>CE6</w:t>
+      </w:r>
+      <w:r>
+        <w:t>:</w:t>
+      </w:r>
+      <w:r>
+        <w:t xml:space="preserve"> </w:t>
+      </w:r>
+      <w:r>
+        <w:t>4</w:t>
       </w:r>
     </w:p>
     <w:p>
@@ -3930,58 +3875,7 @@
         <w:jc w:val="both"/>
       </w:pPr>
       <w:r>
-        <w:t>CE1</w:t>
-      </w:r>
-      <w:r>
-        <w:t>:</w:t>
-      </w:r>
-      <w:r>
-        <w:t xml:space="preserve"> </w:t>
-      </w:r>
-      <w:r>
-        <w:t>20</w:t>
-      </w:r>
-    </w:p>
-    <w:p>
-      <w:pPr>
-        <w:numPr>
-          <w:ilvl w:val="1"/>
-          <w:numId w:val="3"/>
-        </w:numPr>
-        <w:jc w:val="both"/>
-      </w:pPr>
-      <w:r>
-        <w:t>CE2</w:t>
-      </w:r>
-      <w:r>
-        <w:t>:</w:t>
-      </w:r>
-      <w:r>
-        <w:t xml:space="preserve"> </w:t>
-      </w:r>
-      <w:r>
-        <w:t>44</w:t>
-      </w:r>
-    </w:p>
-    <w:p>
-      <w:pPr>
-        <w:numPr>
-          <w:ilvl w:val="1"/>
-          <w:numId w:val="3"/>
-        </w:numPr>
-        <w:jc w:val="both"/>
-      </w:pPr>
-      <w:r>
-        <w:t>CE6</w:t>
-      </w:r>
-      <w:r>
-        <w:t>:</w:t>
-      </w:r>
-      <w:r>
-        <w:t xml:space="preserve"> </w:t>
-      </w:r>
-      <w:r>
-        <w:t>4</w:t>
+        <w:t>Encaminhados para elegibilidade: 61 artigos</w:t>
       </w:r>
     </w:p>
     <w:p>
@@ -3998,70 +3892,116 @@
           <w:b/>
           <w:bCs/>
         </w:rPr>
-        <w:t>Adicionados (Elegíveis / Amostra Final):</w:t>
+        <w:t>Elegibilidade (Texto Completo):</w:t>
+      </w:r>
+      <w:r>
+        <w:t xml:space="preserve"> 61 artigos avaliados</w:t>
+      </w:r>
+    </w:p>
+    <w:p>
+      <w:pPr>
+        <w:pStyle w:val="PargrafodaLista"/>
+        <w:numPr>
+          <w:ilvl w:val="1"/>
+          <w:numId w:val="3"/>
+        </w:numPr>
+        <w:jc w:val="both"/>
+      </w:pPr>
+      <w:r>
+        <w:t>Excluídos sem leitura: 4 artigos (CE8)</w:t>
+      </w:r>
+    </w:p>
+    <w:p>
+      <w:pPr>
+        <w:pStyle w:val="PargrafodaLista"/>
+        <w:numPr>
+          <w:ilvl w:val="1"/>
+          <w:numId w:val="3"/>
+        </w:numPr>
+        <w:jc w:val="both"/>
+      </w:pPr>
+      <w:r>
+        <w:t>Lidos integralmente: 57 artigos</w:t>
+      </w:r>
+    </w:p>
+    <w:p>
+      <w:pPr>
+        <w:pStyle w:val="PargrafodaLista"/>
+        <w:numPr>
+          <w:ilvl w:val="1"/>
+          <w:numId w:val="3"/>
+        </w:numPr>
+        <w:jc w:val="both"/>
+      </w:pPr>
+      <w:r>
+        <w:t>Excluídos após leitura: 1 artigo (CE</w:t>
+      </w:r>
+      <w:r>
+        <w:t>2</w:t>
+      </w:r>
+      <w:r>
+        <w:t>)</w:t>
+      </w:r>
+    </w:p>
+    <w:p>
+      <w:pPr>
+        <w:pStyle w:val="PargrafodaLista"/>
+        <w:numPr>
+          <w:ilvl w:val="1"/>
+          <w:numId w:val="3"/>
+        </w:numPr>
+        <w:jc w:val="both"/>
+      </w:pPr>
+      <w:r>
+        <w:t>Amostra Final: 56</w:t>
+      </w:r>
+      <w:r>
+        <w:t xml:space="preserve"> artigos restantes (</w:t>
+      </w:r>
+      <w:r>
+        <w:t>129</w:t>
       </w:r>
       <w:r>
         <w:t xml:space="preserve"> </w:t>
       </w:r>
       <w:r>
-        <w:t>6</w:t>
-      </w:r>
-      <w:r>
-        <w:t>1</w:t>
-      </w:r>
-      <w:r>
-        <w:t xml:space="preserve"> artigos restantes (</w:t>
-      </w:r>
-      <w:r>
-        <w:t>1</w:t>
-      </w:r>
-      <w:r>
-        <w:t>29</w:t>
-      </w:r>
-      <w:r>
-        <w:t xml:space="preserve"> - </w:t>
-      </w:r>
-      <w:r>
-        <w:t>6</w:t>
-      </w:r>
-      <w:r>
-        <w:t>8</w:t>
+        <w:t>-</w:t>
+      </w:r>
+      <w:r>
+        <w:t xml:space="preserve"> </w:t>
+      </w:r>
+      <w:r>
+        <w:t>68 - 5</w:t>
       </w:r>
       <w:r>
         <w:t xml:space="preserve"> = </w:t>
       </w:r>
       <w:r>
-        <w:t>6</w:t>
-      </w:r>
-      <w:r>
-        <w:t>1</w:t>
-      </w:r>
-      <w:r>
-        <w:t xml:space="preserve">, incluindo 1 </w:t>
-      </w:r>
-      <w:r>
-        <w:t>classificado como</w:t>
-      </w:r>
-      <w:r>
-        <w:t xml:space="preserve"> dúvida</w:t>
-      </w:r>
-      <w:r>
-        <w:t>).</w:t>
-      </w:r>
-    </w:p>
-    <w:p/>
-    <w:p>
-      <w:pPr>
-        <w:rPr>
-          <w:b/>
-          <w:bCs/>
-        </w:rPr>
-      </w:pPr>
-      <w:r>
-        <w:rPr>
-          <w:b/>
-          <w:bCs/>
-        </w:rPr>
+        <w:t>56</w:t>
+      </w:r>
+      <w:r>
+        <w:t>)</w:t>
+      </w:r>
+    </w:p>
+    <w:p/>
+    <w:p/>
+    <w:p/>
+    <w:p/>
+    <w:p/>
+    <w:p/>
+    <w:p>
+      <w:pPr>
+        <w:rPr>
+          <w:b/>
+          <w:bCs/>
+        </w:rPr>
+      </w:pPr>
+      <w:r>
+        <w:rPr>
+          <w:b/>
+          <w:bCs/>
+        </w:rPr>
+        <w:lastRenderedPageBreak/>
         <w:t>7.2. Diagrama</w:t>
       </w:r>
       <w:r>
@@ -4128,28 +4068,26 @@
         </w:drawing>
       </w:r>
     </w:p>
-    <w:p/>
-    <w:p>
-      <w:pPr>
-        <w:rPr>
-          <w:b/>
-          <w:bCs/>
-        </w:rPr>
-      </w:pPr>
-    </w:p>
-    <w:p>
-      <w:pPr>
-        <w:rPr>
-          <w:b/>
-          <w:bCs/>
-        </w:rPr>
-      </w:pPr>
-      <w:r>
-        <w:rPr>
-          <w:b/>
-          <w:bCs/>
-        </w:rPr>
-        <w:lastRenderedPageBreak/>
+    <w:p>
+      <w:pPr>
+        <w:rPr>
+          <w:b/>
+          <w:bCs/>
+        </w:rPr>
+      </w:pPr>
+    </w:p>
+    <w:p>
+      <w:pPr>
+        <w:rPr>
+          <w:b/>
+          <w:bCs/>
+        </w:rPr>
+      </w:pPr>
+      <w:r>
+        <w:rPr>
+          <w:b/>
+          <w:bCs/>
+        </w:rPr>
         <w:t>8. AMEAÇAS À VALIDADE</w:t>
       </w:r>
     </w:p>
@@ -4167,7 +4105,10 @@
         <w:jc w:val="both"/>
       </w:pPr>
       <w:r>
-        <w:t>As ameaças à validade identificadas neste estudo envolvem: 1) a elaboração da string de busca; 2) a possível ausência de estudos primários relevantes; 3) a confiabilidade na seleção; 4) a confiabilidade na extração de dados.</w:t>
+        <w:t>As ameaças à validade identificadas neste estudo envolvem: 1) a elaboração da string de busca; 2) a possível ausência de estudos primários relevantes; 3) a confiabilidade na seleção; 4) a confiabilidade na extração de dados</w:t>
+      </w:r>
+      <w:r>
+        <w:t>; 5) a inacessibilidade ao texto completo de estudos primários.</w:t>
       </w:r>
     </w:p>
     <w:p>
@@ -4188,29 +4129,15 @@
         <w:t>Com o objetivo de reduzir o impacto da ameaça 3, foram definidas questões de pesquisa estruturadas pelo framework GQM e derivados critérios explícitos de inclusão e exclusão, detalhados o suficiente para orientar decisões de triagem de forma objetiva e rastreável. Como limitação, reconhece-se que a condução por um único pesquisador pode introduzir viés nas etapas de triagem e extração de dados, caracterizando também a ameaça 4. A definição rigorosa dos critérios busca mitigar parcialmente esse risco, ainda que não o elimine integralmente.</w:t>
       </w:r>
     </w:p>
-    <w:p/>
-    <w:p/>
-    <w:p/>
-    <w:p/>
-    <w:p/>
-    <w:p/>
-    <w:p/>
-    <w:p/>
-    <w:p/>
-    <w:p/>
-    <w:p/>
-    <w:p/>
-    <w:p/>
-    <w:p/>
-    <w:p/>
-    <w:p/>
-    <w:p/>
-    <w:p/>
-    <w:p/>
-    <w:p/>
-    <w:p/>
-    <w:p/>
-    <w:p/>
+    <w:p>
+      <w:pPr>
+        <w:ind w:firstLine="720"/>
+        <w:jc w:val="both"/>
+      </w:pPr>
+      <w:r>
+        <w:t>A ameaça 5 decorre da inacessibilidade ao texto completo de 4 artigos após esgotadas as alternativas de acesso disponíveis (CAPES/UFG, Google Scholar e ResearchGate). Estes estudos foram excluídos por inacessibilidade (CE8), seguindo prática aceita na literatura (KITCHENHAM; CHARTERS, 2007). É possível que artigos relevantes tenham sido descartados por restrição de acesso, o que pode introduzir viés de seleção na amostra final.</w:t>
+      </w:r>
+    </w:p>
     <w:p/>
     <w:p/>
     <w:p/>
@@ -4473,7 +4400,7 @@
         <w:rFonts w:ascii="Courier New" w:hAnsi="Courier New" w:cs="Courier New" w:hint="default"/>
       </w:rPr>
     </w:lvl>
-    <w:lvl w:ilvl="2" w:tplc="04160005" w:tentative="1">
+    <w:lvl w:ilvl="2" w:tplc="04160005">
       <w:start w:val="1"/>
       <w:numFmt w:val="bullet"/>
       <w:lvlText w:val=""/>

</xml_diff>